<commit_message>
updated class 10 CHAPTER - 13,14,15,16
</commit_message>
<xml_diff>
--- a/pdf/class 10/CLASS 10 CH-14.docx
+++ b/pdf/class 10/CLASS 10 CH-14.docx
@@ -68,8 +68,6 @@
         </w:rPr>
         <w:t>4</w:t>
       </w:r>
-      <w:bookmarkStart w:id="0" w:name="_GoBack"/>
-      <w:bookmarkEnd w:id="0"/>
     </w:p>
     <w:p>
       <w:pPr>
@@ -105,50 +103,2763 @@
         <w:rPr>
           <w:b/>
           <w:bCs/>
+          <w:color w:val="0070C0"/>
           <w:sz w:val="36"/>
           <w:szCs w:val="36"/>
         </w:rPr>
       </w:pPr>
       <w:r>
+        <w:rPr>
+          <w:b/>
+          <w:bCs/>
+          <w:color w:val="0070C0"/>
+          <w:sz w:val="36"/>
+          <w:szCs w:val="36"/>
+        </w:rPr>
+        <w:t>TICK (</w:t>
+      </w:r>
+      <w:r>
+        <w:rPr>
+          <w:rFonts w:ascii="Segoe UI Symbol" w:hAnsi="Segoe UI Symbol" w:cs="Segoe UI Symbol"/>
+          <w:b/>
+          <w:bCs/>
+          <w:color w:val="0070C0"/>
+          <w:sz w:val="36"/>
+          <w:szCs w:val="36"/>
+        </w:rPr>
+        <w:t>✓</w:t>
+      </w:r>
+      <w:r>
+        <w:rPr>
+          <w:b/>
+          <w:bCs/>
+          <w:color w:val="0070C0"/>
+          <w:sz w:val="36"/>
+          <w:szCs w:val="36"/>
+        </w:rPr>
+        <w:t>) THE CORRECT ANSWER</w:t>
+      </w:r>
+    </w:p>
+    <w:p>
+      <w:pPr>
+        <w:pStyle w:val="Heading3"/>
+        <w:spacing w:before="0"/>
+        <w:rPr>
+          <w:rFonts w:ascii="Times New Roman" w:hAnsi="Times New Roman" w:cs="Times New Roman"/>
+        </w:rPr>
+      </w:pPr>
+      <w:r>
+        <w:rPr>
+          <w:rStyle w:val="Strong"/>
+          <w:rFonts w:ascii="Times New Roman" w:hAnsi="Times New Roman" w:cs="Times New Roman"/>
+          <w:b w:val="0"/>
+          <w:bCs w:val="0"/>
+        </w:rPr>
+        <w:t>1. Which of the following terms is used to denote the class from which the data is inherited?</w:t>
+      </w:r>
+    </w:p>
+    <w:p>
+      <w:pPr>
+        <w:pStyle w:val="NormalWeb"/>
+        <w:spacing w:before="0" w:beforeAutospacing="0"/>
+        <w:ind w:left="360"/>
+      </w:pPr>
+      <w:r>
+        <w:t>a. Base class</w:t>
+      </w:r>
+      <w:r>
+        <w:br/>
+        <w:t>b. Derived class</w:t>
+      </w:r>
+      <w:r>
+        <w:br/>
+        <w:t>c. Subclass</w:t>
+      </w:r>
+      <w:r>
+        <w:br/>
+        <w:t>d. None of these</w:t>
+      </w:r>
+    </w:p>
+    <w:p>
+      <w:pPr>
+        <w:pStyle w:val="NormalWeb"/>
+        <w:rPr>
+          <w:color w:val="FF0000"/>
+        </w:rPr>
+      </w:pPr>
+      <w:r>
+        <w:rPr>
+          <w:rFonts w:ascii="Segoe UI Symbol" w:hAnsi="Segoe UI Symbol" w:cs="Segoe UI Symbol"/>
+          <w:color w:val="FF0000"/>
+        </w:rPr>
+        <w:t>✅</w:t>
+      </w:r>
+      <w:r>
+        <w:rPr>
+          <w:color w:val="FF0000"/>
+        </w:rPr>
+        <w:t xml:space="preserve"> </w:t>
+      </w:r>
+      <w:r>
+        <w:rPr>
+          <w:rStyle w:val="Strong"/>
+          <w:color w:val="FF0000"/>
+        </w:rPr>
+        <w:t>Answer: a. Base class</w:t>
+      </w:r>
+    </w:p>
+    <w:p>
+      <w:pPr>
+        <w:pStyle w:val="NormalWeb"/>
+      </w:pPr>
+      <w:r>
+        <w:rPr>
+          <w:rFonts w:ascii="Segoe UI Symbol" w:hAnsi="Segoe UI Symbol" w:cs="Segoe UI Symbol"/>
+        </w:rPr>
+        <w:t>💡</w:t>
+      </w:r>
+      <w:r>
+        <w:t xml:space="preserve"> </w:t>
+      </w:r>
+      <w:r>
+        <w:rPr>
+          <w:rStyle w:val="Strong"/>
+        </w:rPr>
+        <w:t>Explanation</w:t>
+      </w:r>
+      <w:proofErr w:type="gramStart"/>
+      <w:r>
+        <w:rPr>
+          <w:rStyle w:val="Strong"/>
+        </w:rPr>
+        <w:t>:</w:t>
+      </w:r>
+      <w:proofErr w:type="gramEnd"/>
+      <w:r>
+        <w:br/>
+        <w:t xml:space="preserve">The class from which properties are inherited is called the </w:t>
+      </w:r>
+      <w:r>
+        <w:rPr>
+          <w:rStyle w:val="Strong"/>
+        </w:rPr>
+        <w:t>Base (or Super) class</w:t>
+      </w:r>
+      <w:r>
+        <w:t>.</w:t>
+      </w:r>
+    </w:p>
+    <w:p>
+      <w:pPr>
+        <w:pStyle w:val="Heading3"/>
+        <w:spacing w:before="0"/>
+        <w:rPr>
+          <w:rFonts w:ascii="Times New Roman" w:hAnsi="Times New Roman" w:cs="Times New Roman"/>
+        </w:rPr>
+      </w:pPr>
+      <w:r>
+        <w:rPr>
+          <w:rStyle w:val="Strong"/>
+          <w:rFonts w:ascii="Times New Roman" w:hAnsi="Times New Roman" w:cs="Times New Roman"/>
+          <w:b w:val="0"/>
+          <w:bCs w:val="0"/>
+        </w:rPr>
+        <w:t>2. Which of the following types of inheritance is used when more than one type of inheritances coded together?</w:t>
+      </w:r>
+    </w:p>
+    <w:p>
+      <w:pPr>
+        <w:pStyle w:val="NormalWeb"/>
+        <w:spacing w:before="0" w:beforeAutospacing="0"/>
+        <w:ind w:left="360"/>
+      </w:pPr>
+      <w:r>
+        <w:t>a. Single inheritance</w:t>
+      </w:r>
+      <w:r>
+        <w:br/>
+        <w:t xml:space="preserve">b. </w:t>
+      </w:r>
+      <w:proofErr w:type="gramStart"/>
+      <w:r>
+        <w:t>Multiple</w:t>
+      </w:r>
+      <w:proofErr w:type="gramEnd"/>
+      <w:r>
+        <w:t xml:space="preserve"> inheritance</w:t>
+      </w:r>
+      <w:r>
+        <w:br/>
+        <w:t>c. Multilevel inheritance</w:t>
+      </w:r>
+      <w:r>
+        <w:br/>
+        <w:t>d. Hybrid inheritance</w:t>
+      </w:r>
+    </w:p>
+    <w:p>
+      <w:pPr>
+        <w:pStyle w:val="NormalWeb"/>
+        <w:rPr>
+          <w:color w:val="FF0000"/>
+        </w:rPr>
+      </w:pPr>
+      <w:r>
+        <w:rPr>
+          <w:rFonts w:ascii="Segoe UI Symbol" w:hAnsi="Segoe UI Symbol" w:cs="Segoe UI Symbol"/>
+          <w:color w:val="FF0000"/>
+        </w:rPr>
+        <w:t>✅</w:t>
+      </w:r>
+      <w:r>
+        <w:rPr>
+          <w:color w:val="FF0000"/>
+        </w:rPr>
+        <w:t xml:space="preserve"> </w:t>
+      </w:r>
+      <w:r>
+        <w:rPr>
+          <w:rStyle w:val="Strong"/>
+          <w:color w:val="FF0000"/>
+        </w:rPr>
+        <w:t>Answer: d. Hybrid inheritance</w:t>
+      </w:r>
+    </w:p>
+    <w:p>
+      <w:pPr>
+        <w:pStyle w:val="NormalWeb"/>
+      </w:pPr>
+      <w:r>
+        <w:rPr>
+          <w:rFonts w:ascii="Segoe UI Symbol" w:hAnsi="Segoe UI Symbol" w:cs="Segoe UI Symbol"/>
+        </w:rPr>
+        <w:t>💡</w:t>
+      </w:r>
+      <w:r>
+        <w:t xml:space="preserve"> </w:t>
+      </w:r>
+      <w:r>
+        <w:rPr>
+          <w:rStyle w:val="Strong"/>
+        </w:rPr>
+        <w:t>Explanation</w:t>
+      </w:r>
+      <w:proofErr w:type="gramStart"/>
+      <w:r>
+        <w:rPr>
+          <w:rStyle w:val="Strong"/>
+        </w:rPr>
+        <w:t>:</w:t>
+      </w:r>
+      <w:proofErr w:type="gramEnd"/>
+      <w:r>
+        <w:br/>
+        <w:t>Hybrid = combination of two or more inheritance types.</w:t>
+      </w:r>
+    </w:p>
+    <w:p>
+      <w:pPr>
+        <w:pStyle w:val="Heading3"/>
+        <w:spacing w:before="0"/>
+        <w:rPr>
+          <w:rFonts w:ascii="Times New Roman" w:hAnsi="Times New Roman" w:cs="Times New Roman"/>
+        </w:rPr>
+      </w:pPr>
+      <w:r>
+        <w:rPr>
+          <w:rStyle w:val="Strong"/>
+          <w:rFonts w:ascii="Times New Roman" w:hAnsi="Times New Roman" w:cs="Times New Roman"/>
+          <w:b w:val="0"/>
+          <w:bCs w:val="0"/>
+        </w:rPr>
+        <w:t>3. Which of the following variables can be accessed from anywhere?</w:t>
+      </w:r>
+    </w:p>
+    <w:p>
+      <w:pPr>
+        <w:pStyle w:val="NormalWeb"/>
+        <w:spacing w:before="0" w:beforeAutospacing="0"/>
+        <w:ind w:left="360"/>
+      </w:pPr>
+      <w:r>
+        <w:t>a. Protected</w:t>
+      </w:r>
+      <w:r>
+        <w:br/>
+        <w:t>b. Public</w:t>
+      </w:r>
+      <w:r>
+        <w:br/>
+        <w:t>c. Private</w:t>
+      </w:r>
+      <w:r>
+        <w:br/>
+        <w:t>d. None of these</w:t>
+      </w:r>
+    </w:p>
+    <w:p>
+      <w:pPr>
+        <w:pStyle w:val="NormalWeb"/>
+        <w:rPr>
+          <w:color w:val="FF0000"/>
+        </w:rPr>
+      </w:pPr>
+      <w:r>
+        <w:rPr>
+          <w:rFonts w:ascii="Segoe UI Symbol" w:hAnsi="Segoe UI Symbol" w:cs="Segoe UI Symbol"/>
+          <w:color w:val="FF0000"/>
+        </w:rPr>
+        <w:t>✅</w:t>
+      </w:r>
+      <w:r>
+        <w:rPr>
+          <w:color w:val="FF0000"/>
+        </w:rPr>
+        <w:t xml:space="preserve"> </w:t>
+      </w:r>
+      <w:r>
+        <w:rPr>
+          <w:rStyle w:val="Strong"/>
+          <w:color w:val="FF0000"/>
+        </w:rPr>
+        <w:t>Answer: b. Public</w:t>
+      </w:r>
+    </w:p>
+    <w:p>
+      <w:pPr>
+        <w:pStyle w:val="NormalWeb"/>
+      </w:pPr>
+      <w:r>
+        <w:rPr>
+          <w:rFonts w:ascii="Segoe UI Symbol" w:hAnsi="Segoe UI Symbol" w:cs="Segoe UI Symbol"/>
+        </w:rPr>
+        <w:t>💡</w:t>
+      </w:r>
+      <w:r>
+        <w:t xml:space="preserve"> </w:t>
+      </w:r>
+      <w:r>
+        <w:rPr>
+          <w:rStyle w:val="Strong"/>
+        </w:rPr>
+        <w:t>Explanation</w:t>
+      </w:r>
+      <w:proofErr w:type="gramStart"/>
+      <w:r>
+        <w:rPr>
+          <w:rStyle w:val="Strong"/>
+        </w:rPr>
+        <w:t>:</w:t>
+      </w:r>
+      <w:proofErr w:type="gramEnd"/>
+      <w:r>
+        <w:br/>
+        <w:t>Public variables are accessible everywhere.</w:t>
+      </w:r>
+    </w:p>
+    <w:p>
+      <w:pPr>
+        <w:pStyle w:val="Heading3"/>
+        <w:spacing w:before="0"/>
+        <w:rPr>
+          <w:rFonts w:ascii="Times New Roman" w:hAnsi="Times New Roman" w:cs="Times New Roman"/>
+        </w:rPr>
+      </w:pPr>
+      <w:r>
+        <w:rPr>
+          <w:rStyle w:val="Strong"/>
+          <w:rFonts w:ascii="Times New Roman" w:hAnsi="Times New Roman" w:cs="Times New Roman"/>
+          <w:b w:val="0"/>
+          <w:bCs w:val="0"/>
+        </w:rPr>
+        <w:t>4. Instance Variables are also known as __________</w:t>
+      </w:r>
+    </w:p>
+    <w:p>
+      <w:pPr>
+        <w:pStyle w:val="NormalWeb"/>
+        <w:spacing w:before="0" w:beforeAutospacing="0"/>
+        <w:ind w:left="360"/>
+      </w:pPr>
+      <w:r>
+        <w:t xml:space="preserve">a. Static data </w:t>
+      </w:r>
+      <w:proofErr w:type="gramStart"/>
+      <w:r>
+        <w:t>members</w:t>
+      </w:r>
+      <w:proofErr w:type="gramEnd"/>
+      <w:r>
+        <w:br/>
+        <w:t>b. Non-static data members</w:t>
+      </w:r>
+      <w:r>
+        <w:br/>
+        <w:t>c. Local variable</w:t>
+      </w:r>
+      <w:r>
+        <w:br/>
+        <w:t>d. Instance variable</w:t>
+      </w:r>
+    </w:p>
+    <w:p>
+      <w:pPr>
+        <w:pStyle w:val="NormalWeb"/>
+        <w:rPr>
+          <w:color w:val="FF0000"/>
+        </w:rPr>
+      </w:pPr>
+      <w:r>
+        <w:rPr>
+          <w:rFonts w:ascii="Segoe UI Symbol" w:hAnsi="Segoe UI Symbol" w:cs="Segoe UI Symbol"/>
+          <w:color w:val="FF0000"/>
+        </w:rPr>
+        <w:t>✅</w:t>
+      </w:r>
+      <w:r>
+        <w:rPr>
+          <w:color w:val="FF0000"/>
+        </w:rPr>
+        <w:t xml:space="preserve"> </w:t>
+      </w:r>
+      <w:r>
+        <w:rPr>
+          <w:rStyle w:val="Strong"/>
+          <w:color w:val="FF0000"/>
+        </w:rPr>
+        <w:t>Answer: b. Non-static data members</w:t>
+      </w:r>
+    </w:p>
+    <w:p>
+      <w:pPr>
+        <w:pStyle w:val="NormalWeb"/>
+      </w:pPr>
+      <w:r>
+        <w:rPr>
+          <w:rFonts w:ascii="Segoe UI Symbol" w:hAnsi="Segoe UI Symbol" w:cs="Segoe UI Symbol"/>
+        </w:rPr>
+        <w:lastRenderedPageBreak/>
+        <w:t>💡</w:t>
+      </w:r>
+      <w:r>
+        <w:t xml:space="preserve"> </w:t>
+      </w:r>
+      <w:r>
+        <w:rPr>
+          <w:rStyle w:val="Strong"/>
+        </w:rPr>
+        <w:t>Explanation</w:t>
+      </w:r>
+      <w:proofErr w:type="gramStart"/>
+      <w:r>
+        <w:rPr>
+          <w:rStyle w:val="Strong"/>
+        </w:rPr>
+        <w:t>:</w:t>
+      </w:r>
+      <w:proofErr w:type="gramEnd"/>
+      <w:r>
+        <w:br/>
+        <w:t xml:space="preserve">Instance variables belong to objects → so they are </w:t>
+      </w:r>
+      <w:r>
+        <w:rPr>
+          <w:rStyle w:val="Strong"/>
+        </w:rPr>
+        <w:t>non-static</w:t>
+      </w:r>
+      <w:r>
+        <w:t>.</w:t>
+      </w:r>
+    </w:p>
+    <w:p>
+      <w:pPr>
+        <w:pStyle w:val="Heading3"/>
+        <w:spacing w:before="0"/>
+        <w:rPr>
+          <w:rFonts w:ascii="Times New Roman" w:hAnsi="Times New Roman" w:cs="Times New Roman"/>
+        </w:rPr>
+      </w:pPr>
+      <w:r>
+        <w:rPr>
+          <w:rStyle w:val="Strong"/>
+          <w:rFonts w:ascii="Times New Roman" w:hAnsi="Times New Roman" w:cs="Times New Roman"/>
+          <w:b w:val="0"/>
+          <w:bCs w:val="0"/>
+        </w:rPr>
+        <w:t>5. Which of the following is a block?</w:t>
+      </w:r>
+    </w:p>
+    <w:p>
+      <w:pPr>
+        <w:pStyle w:val="NormalWeb"/>
+        <w:spacing w:before="0" w:beforeAutospacing="0"/>
+        <w:ind w:left="360"/>
+      </w:pPr>
+      <w:r>
+        <w:t>a. A sequence of statements within curly brackets</w:t>
+      </w:r>
+      <w:r>
+        <w:br/>
+        <w:t>b. A sequence of statements within square brackets</w:t>
+      </w:r>
+      <w:r>
+        <w:br/>
+        <w:t>c. A sequence of statements within curly parenthesis</w:t>
+      </w:r>
+      <w:r>
+        <w:br/>
+        <w:t>d. None of these</w:t>
+      </w:r>
+    </w:p>
+    <w:p>
+      <w:pPr>
+        <w:pStyle w:val="NormalWeb"/>
+        <w:rPr>
+          <w:color w:val="FF0000"/>
+        </w:rPr>
+      </w:pPr>
+      <w:r>
+        <w:rPr>
+          <w:rFonts w:ascii="Segoe UI Symbol" w:hAnsi="Segoe UI Symbol" w:cs="Segoe UI Symbol"/>
+          <w:color w:val="FF0000"/>
+        </w:rPr>
+        <w:t>✅</w:t>
+      </w:r>
+      <w:r>
+        <w:rPr>
+          <w:color w:val="FF0000"/>
+        </w:rPr>
+        <w:t xml:space="preserve"> </w:t>
+      </w:r>
+      <w:r>
+        <w:rPr>
+          <w:rStyle w:val="Strong"/>
+          <w:color w:val="FF0000"/>
+        </w:rPr>
+        <w:t xml:space="preserve">Answer: a. </w:t>
+      </w:r>
+      <w:proofErr w:type="gramStart"/>
+      <w:r>
+        <w:rPr>
+          <w:rStyle w:val="Strong"/>
+          <w:color w:val="FF0000"/>
+        </w:rPr>
+        <w:t>A</w:t>
+      </w:r>
+      <w:proofErr w:type="gramEnd"/>
+      <w:r>
+        <w:rPr>
+          <w:rStyle w:val="Strong"/>
+          <w:color w:val="FF0000"/>
+        </w:rPr>
+        <w:t xml:space="preserve"> sequence of statements within curly brackets</w:t>
+      </w:r>
+    </w:p>
+    <w:p>
+      <w:pPr>
+        <w:pStyle w:val="NormalWeb"/>
+      </w:pPr>
+      <w:r>
+        <w:rPr>
+          <w:rFonts w:ascii="Segoe UI Symbol" w:hAnsi="Segoe UI Symbol" w:cs="Segoe UI Symbol"/>
+        </w:rPr>
+        <w:t>💡</w:t>
+      </w:r>
+      <w:r>
+        <w:t xml:space="preserve"> </w:t>
+      </w:r>
+      <w:r>
+        <w:rPr>
+          <w:rStyle w:val="Strong"/>
+        </w:rPr>
+        <w:t>Explanation</w:t>
+      </w:r>
+      <w:proofErr w:type="gramStart"/>
+      <w:r>
+        <w:rPr>
+          <w:rStyle w:val="Strong"/>
+        </w:rPr>
+        <w:t>:</w:t>
+      </w:r>
+      <w:proofErr w:type="gramEnd"/>
+      <w:r>
+        <w:br/>
+        <w:t xml:space="preserve">Block = </w:t>
+      </w:r>
+      <w:r>
+        <w:rPr>
+          <w:rStyle w:val="HTMLCode"/>
+          <w:rFonts w:ascii="Times New Roman" w:hAnsi="Times New Roman" w:cs="Times New Roman"/>
+        </w:rPr>
+        <w:t>{ }</w:t>
+      </w:r>
+    </w:p>
+    <w:p>
+      <w:pPr>
+        <w:pStyle w:val="Heading1"/>
+        <w:rPr>
+          <w:rFonts w:ascii="Times New Roman" w:hAnsi="Times New Roman" w:cs="Times New Roman"/>
+          <w:sz w:val="36"/>
+        </w:rPr>
+      </w:pPr>
+      <w:r>
+        <w:rPr>
+          <w:rFonts w:ascii="Segoe UI Symbol" w:hAnsi="Segoe UI Symbol" w:cs="Segoe UI Symbol"/>
+          <w:sz w:val="36"/>
+        </w:rPr>
+        <w:t>✅</w:t>
+      </w:r>
+      <w:r>
+        <w:rPr>
+          <w:rFonts w:ascii="Times New Roman" w:hAnsi="Times New Roman" w:cs="Times New Roman"/>
+          <w:sz w:val="36"/>
+        </w:rPr>
+        <w:t xml:space="preserve"> </w:t>
+      </w:r>
+      <w:r>
+        <w:rPr>
+          <w:rStyle w:val="Strong"/>
+          <w:rFonts w:ascii="Times New Roman" w:hAnsi="Times New Roman" w:cs="Times New Roman"/>
+          <w:bCs w:val="0"/>
+          <w:sz w:val="36"/>
+        </w:rPr>
+        <w:t>More MCQs (Character &amp; Wrapper Class)</w:t>
+      </w:r>
+    </w:p>
+    <w:p>
+      <w:pPr>
+        <w:pStyle w:val="Heading3"/>
+        <w:spacing w:before="0"/>
+        <w:rPr>
+          <w:rFonts w:ascii="Times New Roman" w:hAnsi="Times New Roman" w:cs="Times New Roman"/>
+        </w:rPr>
+      </w:pPr>
+      <w:r>
+        <w:rPr>
+          <w:rStyle w:val="Strong"/>
+          <w:rFonts w:ascii="Times New Roman" w:hAnsi="Times New Roman" w:cs="Times New Roman"/>
+          <w:b w:val="0"/>
+          <w:bCs w:val="0"/>
+        </w:rPr>
+        <w:t>6. Which method is used to determine whether a character is a digit in Java?</w:t>
+      </w:r>
+    </w:p>
+    <w:p>
+      <w:pPr>
+        <w:pStyle w:val="NormalWeb"/>
+        <w:spacing w:before="0" w:beforeAutospacing="0"/>
+        <w:ind w:left="360"/>
+      </w:pPr>
+      <w:proofErr w:type="gramStart"/>
+      <w:r>
+        <w:t>a</w:t>
+      </w:r>
+      <w:proofErr w:type="gramEnd"/>
+      <w:r>
+        <w:t xml:space="preserve">. </w:t>
+      </w:r>
+      <w:proofErr w:type="spellStart"/>
+      <w:r>
+        <w:t>isDigit</w:t>
+      </w:r>
+      <w:proofErr w:type="spellEnd"/>
+      <w:r>
+        <w:t xml:space="preserve">(char </w:t>
+      </w:r>
+      <w:proofErr w:type="spellStart"/>
+      <w:r>
+        <w:t>ch</w:t>
+      </w:r>
+      <w:proofErr w:type="spellEnd"/>
+      <w:r>
+        <w:t>)</w:t>
+      </w:r>
+      <w:r>
+        <w:br/>
+        <w:t xml:space="preserve">b. </w:t>
+      </w:r>
+      <w:proofErr w:type="spellStart"/>
+      <w:r>
+        <w:t>isLetter</w:t>
+      </w:r>
+      <w:proofErr w:type="spellEnd"/>
+      <w:r>
+        <w:t xml:space="preserve">(char </w:t>
+      </w:r>
+      <w:proofErr w:type="spellStart"/>
+      <w:r>
+        <w:t>ch</w:t>
+      </w:r>
+      <w:proofErr w:type="spellEnd"/>
+      <w:r>
+        <w:t>)</w:t>
+      </w:r>
+      <w:r>
+        <w:br/>
+        <w:t xml:space="preserve">c. </w:t>
+      </w:r>
+      <w:proofErr w:type="spellStart"/>
+      <w:r>
+        <w:t>isLowerCase</w:t>
+      </w:r>
+      <w:proofErr w:type="spellEnd"/>
+      <w:r>
+        <w:t xml:space="preserve">(char </w:t>
+      </w:r>
+      <w:proofErr w:type="spellStart"/>
+      <w:r>
+        <w:t>ch</w:t>
+      </w:r>
+      <w:proofErr w:type="spellEnd"/>
+      <w:r>
+        <w:t>)</w:t>
+      </w:r>
+      <w:r>
+        <w:br/>
+        <w:t xml:space="preserve">d. </w:t>
+      </w:r>
+      <w:proofErr w:type="spellStart"/>
+      <w:r>
+        <w:t>isUpperCase</w:t>
+      </w:r>
+      <w:proofErr w:type="spellEnd"/>
+      <w:r>
+        <w:t xml:space="preserve">(char </w:t>
+      </w:r>
+      <w:proofErr w:type="spellStart"/>
+      <w:r>
+        <w:t>ch</w:t>
+      </w:r>
+      <w:proofErr w:type="spellEnd"/>
+      <w:r>
+        <w:t>)</w:t>
+      </w:r>
+    </w:p>
+    <w:p>
+      <w:pPr>
+        <w:pStyle w:val="NormalWeb"/>
+        <w:rPr>
+          <w:color w:val="FF0000"/>
+        </w:rPr>
+      </w:pPr>
+      <w:r>
+        <w:rPr>
+          <w:rFonts w:ascii="Segoe UI Symbol" w:hAnsi="Segoe UI Symbol" w:cs="Segoe UI Symbol"/>
+          <w:color w:val="FF0000"/>
+        </w:rPr>
+        <w:t>✅</w:t>
+      </w:r>
+      <w:r>
+        <w:rPr>
+          <w:color w:val="FF0000"/>
+        </w:rPr>
+        <w:t xml:space="preserve"> </w:t>
+      </w:r>
+      <w:r>
+        <w:rPr>
+          <w:rStyle w:val="Strong"/>
+          <w:color w:val="FF0000"/>
+        </w:rPr>
+        <w:t xml:space="preserve">Answer: a. </w:t>
+      </w:r>
+      <w:proofErr w:type="spellStart"/>
+      <w:proofErr w:type="gramStart"/>
+      <w:r>
+        <w:rPr>
+          <w:rStyle w:val="Strong"/>
+          <w:color w:val="FF0000"/>
+        </w:rPr>
+        <w:t>isDigit</w:t>
+      </w:r>
+      <w:proofErr w:type="spellEnd"/>
+      <w:r>
+        <w:rPr>
+          <w:rStyle w:val="Strong"/>
+          <w:color w:val="FF0000"/>
+        </w:rPr>
+        <w:t>(</w:t>
+      </w:r>
+      <w:proofErr w:type="gramEnd"/>
+      <w:r>
+        <w:rPr>
+          <w:rStyle w:val="Strong"/>
+          <w:color w:val="FF0000"/>
+        </w:rPr>
+        <w:t xml:space="preserve">char </w:t>
+      </w:r>
+      <w:proofErr w:type="spellStart"/>
+      <w:r>
+        <w:rPr>
+          <w:rStyle w:val="Strong"/>
+          <w:color w:val="FF0000"/>
+        </w:rPr>
+        <w:t>ch</w:t>
+      </w:r>
+      <w:proofErr w:type="spellEnd"/>
+      <w:r>
+        <w:rPr>
+          <w:rStyle w:val="Strong"/>
+          <w:color w:val="FF0000"/>
+        </w:rPr>
+        <w:t>)</w:t>
+      </w:r>
+    </w:p>
+    <w:p>
+      <w:pPr>
+        <w:pStyle w:val="Heading3"/>
+        <w:spacing w:before="0"/>
+        <w:rPr>
+          <w:rFonts w:ascii="Times New Roman" w:hAnsi="Times New Roman" w:cs="Times New Roman"/>
+        </w:rPr>
+      </w:pPr>
+      <w:r>
+        <w:rPr>
+          <w:rStyle w:val="Strong"/>
+          <w:rFonts w:ascii="Times New Roman" w:hAnsi="Times New Roman" w:cs="Times New Roman"/>
+          <w:b w:val="0"/>
+          <w:bCs w:val="0"/>
+        </w:rPr>
+        <w:t xml:space="preserve">7. What does the </w:t>
+      </w:r>
+      <w:proofErr w:type="spellStart"/>
+      <w:proofErr w:type="gramStart"/>
+      <w:r>
+        <w:rPr>
+          <w:rStyle w:val="Strong"/>
+          <w:rFonts w:ascii="Times New Roman" w:hAnsi="Times New Roman" w:cs="Times New Roman"/>
+          <w:b w:val="0"/>
+          <w:bCs w:val="0"/>
+        </w:rPr>
+        <w:t>Character.isLetter</w:t>
+      </w:r>
+      <w:proofErr w:type="spellEnd"/>
+      <w:r>
+        <w:rPr>
+          <w:rStyle w:val="Strong"/>
+          <w:rFonts w:ascii="Times New Roman" w:hAnsi="Times New Roman" w:cs="Times New Roman"/>
+          <w:b w:val="0"/>
+          <w:bCs w:val="0"/>
+        </w:rPr>
+        <w:t>(</w:t>
+      </w:r>
+      <w:proofErr w:type="gramEnd"/>
+      <w:r>
+        <w:rPr>
+          <w:rStyle w:val="Strong"/>
+          <w:rFonts w:ascii="Times New Roman" w:hAnsi="Times New Roman" w:cs="Times New Roman"/>
+          <w:b w:val="0"/>
+          <w:bCs w:val="0"/>
+        </w:rPr>
+        <w:t xml:space="preserve">char </w:t>
+      </w:r>
+      <w:proofErr w:type="spellStart"/>
+      <w:r>
+        <w:rPr>
+          <w:rStyle w:val="Strong"/>
+          <w:rFonts w:ascii="Times New Roman" w:hAnsi="Times New Roman" w:cs="Times New Roman"/>
+          <w:b w:val="0"/>
+          <w:bCs w:val="0"/>
+        </w:rPr>
+        <w:t>ch</w:t>
+      </w:r>
+      <w:proofErr w:type="spellEnd"/>
+      <w:r>
+        <w:rPr>
+          <w:rStyle w:val="Strong"/>
+          <w:rFonts w:ascii="Times New Roman" w:hAnsi="Times New Roman" w:cs="Times New Roman"/>
+          <w:b w:val="0"/>
+          <w:bCs w:val="0"/>
+        </w:rPr>
+        <w:t>) method return?</w:t>
+      </w:r>
+    </w:p>
+    <w:p>
+      <w:pPr>
+        <w:pStyle w:val="NormalWeb"/>
+        <w:spacing w:before="0" w:beforeAutospacing="0"/>
+        <w:ind w:left="360"/>
+      </w:pPr>
+      <w:proofErr w:type="gramStart"/>
+      <w:r>
+        <w:t>a</w:t>
+      </w:r>
+      <w:proofErr w:type="gramEnd"/>
+      <w:r>
+        <w:t>. true if lowercase letter</w:t>
+      </w:r>
+      <w:r>
+        <w:br/>
+        <w:t>b. true if uppercase letter</w:t>
+      </w:r>
+      <w:r>
+        <w:br/>
+        <w:t>c. true if letter (lowercase or uppercase)</w:t>
+      </w:r>
+      <w:r>
+        <w:br/>
+        <w:t>d. false if not a letter</w:t>
+      </w:r>
+    </w:p>
+    <w:p>
+      <w:pPr>
+        <w:pStyle w:val="NormalWeb"/>
+        <w:rPr>
+          <w:color w:val="FF0000"/>
+        </w:rPr>
+      </w:pPr>
+      <w:r>
+        <w:rPr>
+          <w:rFonts w:ascii="Segoe UI Symbol" w:hAnsi="Segoe UI Symbol" w:cs="Segoe UI Symbol"/>
+          <w:color w:val="FF0000"/>
+        </w:rPr>
+        <w:t>✅</w:t>
+      </w:r>
+      <w:r>
+        <w:rPr>
+          <w:color w:val="FF0000"/>
+        </w:rPr>
+        <w:t xml:space="preserve"> </w:t>
+      </w:r>
+      <w:r>
+        <w:rPr>
+          <w:rStyle w:val="Strong"/>
+          <w:color w:val="FF0000"/>
+        </w:rPr>
+        <w:t>Answer: c. true if letter (lowercase or uppercase)</w:t>
+      </w:r>
+    </w:p>
+    <w:p>
+      <w:pPr>
+        <w:pStyle w:val="Heading3"/>
+        <w:spacing w:before="0"/>
+        <w:rPr>
+          <w:rFonts w:ascii="Times New Roman" w:hAnsi="Times New Roman" w:cs="Times New Roman"/>
+        </w:rPr>
+      </w:pPr>
+      <w:r>
+        <w:rPr>
+          <w:rStyle w:val="Strong"/>
+          <w:rFonts w:ascii="Times New Roman" w:hAnsi="Times New Roman" w:cs="Times New Roman"/>
+          <w:b w:val="0"/>
+          <w:bCs w:val="0"/>
+        </w:rPr>
+        <w:t>8. Which method is used to convert the character argument to lowercase?</w:t>
+      </w:r>
+    </w:p>
+    <w:p>
+      <w:pPr>
+        <w:pStyle w:val="NormalWeb"/>
+        <w:spacing w:before="0" w:beforeAutospacing="0"/>
+        <w:ind w:left="360"/>
+      </w:pPr>
+      <w:proofErr w:type="gramStart"/>
+      <w:r>
+        <w:t>a</w:t>
+      </w:r>
+      <w:proofErr w:type="gramEnd"/>
+      <w:r>
+        <w:t xml:space="preserve">. </w:t>
+      </w:r>
+      <w:proofErr w:type="spellStart"/>
+      <w:r>
+        <w:t>tolowerCase</w:t>
+      </w:r>
+      <w:proofErr w:type="spellEnd"/>
+      <w:r>
+        <w:t xml:space="preserve">(char </w:t>
+      </w:r>
+      <w:proofErr w:type="spellStart"/>
+      <w:r>
+        <w:t>ch</w:t>
+      </w:r>
+      <w:proofErr w:type="spellEnd"/>
+      <w:r>
+        <w:t>)</w:t>
+      </w:r>
+      <w:r>
+        <w:br/>
+        <w:t xml:space="preserve">b. </w:t>
+      </w:r>
+      <w:proofErr w:type="spellStart"/>
+      <w:r>
+        <w:t>toUpperCase</w:t>
+      </w:r>
+      <w:proofErr w:type="spellEnd"/>
+      <w:r>
+        <w:t xml:space="preserve">(char </w:t>
+      </w:r>
+      <w:proofErr w:type="spellStart"/>
+      <w:r>
+        <w:t>ch</w:t>
+      </w:r>
+      <w:proofErr w:type="spellEnd"/>
+      <w:r>
+        <w:t>)</w:t>
+      </w:r>
+      <w:r>
+        <w:br/>
+        <w:t xml:space="preserve">c. </w:t>
+      </w:r>
+      <w:proofErr w:type="spellStart"/>
+      <w:r>
+        <w:t>toLower</w:t>
+      </w:r>
+      <w:proofErr w:type="spellEnd"/>
+      <w:r>
+        <w:t xml:space="preserve">(char </w:t>
+      </w:r>
+      <w:proofErr w:type="spellStart"/>
+      <w:r>
+        <w:t>ch</w:t>
+      </w:r>
+      <w:proofErr w:type="spellEnd"/>
+      <w:r>
+        <w:t>)</w:t>
+      </w:r>
+      <w:r>
+        <w:br/>
+        <w:t xml:space="preserve">d. </w:t>
+      </w:r>
+      <w:proofErr w:type="spellStart"/>
+      <w:r>
+        <w:t>toLowerCase</w:t>
+      </w:r>
+      <w:proofErr w:type="spellEnd"/>
+      <w:r>
+        <w:t xml:space="preserve">(char </w:t>
+      </w:r>
+      <w:proofErr w:type="spellStart"/>
+      <w:r>
+        <w:t>ch</w:t>
+      </w:r>
+      <w:proofErr w:type="spellEnd"/>
+      <w:r>
+        <w:t>)</w:t>
+      </w:r>
+    </w:p>
+    <w:p>
+      <w:pPr>
+        <w:pStyle w:val="NormalWeb"/>
+        <w:rPr>
+          <w:color w:val="FF0000"/>
+        </w:rPr>
+      </w:pPr>
+      <w:r>
+        <w:rPr>
+          <w:rFonts w:ascii="Segoe UI Symbol" w:hAnsi="Segoe UI Symbol" w:cs="Segoe UI Symbol"/>
+          <w:color w:val="FF0000"/>
+        </w:rPr>
+        <w:t>✅</w:t>
+      </w:r>
+      <w:r>
+        <w:rPr>
+          <w:color w:val="FF0000"/>
+        </w:rPr>
+        <w:t xml:space="preserve"> </w:t>
+      </w:r>
+      <w:r>
+        <w:rPr>
+          <w:rStyle w:val="Strong"/>
+          <w:color w:val="FF0000"/>
+        </w:rPr>
+        <w:t xml:space="preserve">Answer: d. </w:t>
+      </w:r>
+      <w:proofErr w:type="spellStart"/>
+      <w:proofErr w:type="gramStart"/>
+      <w:r>
+        <w:rPr>
+          <w:rStyle w:val="Strong"/>
+          <w:color w:val="FF0000"/>
+        </w:rPr>
+        <w:t>toLowerCase</w:t>
+      </w:r>
+      <w:proofErr w:type="spellEnd"/>
+      <w:r>
+        <w:rPr>
+          <w:rStyle w:val="Strong"/>
+          <w:color w:val="FF0000"/>
+        </w:rPr>
+        <w:t>(</w:t>
+      </w:r>
+      <w:proofErr w:type="gramEnd"/>
+      <w:r>
+        <w:rPr>
+          <w:rStyle w:val="Strong"/>
+          <w:color w:val="FF0000"/>
+        </w:rPr>
+        <w:t xml:space="preserve">char </w:t>
+      </w:r>
+      <w:proofErr w:type="spellStart"/>
+      <w:r>
+        <w:rPr>
+          <w:rStyle w:val="Strong"/>
+          <w:color w:val="FF0000"/>
+        </w:rPr>
+        <w:t>ch</w:t>
+      </w:r>
+      <w:proofErr w:type="spellEnd"/>
+      <w:r>
+        <w:rPr>
+          <w:rStyle w:val="Strong"/>
+          <w:color w:val="FF0000"/>
+        </w:rPr>
+        <w:t>)</w:t>
+      </w:r>
+    </w:p>
+    <w:p>
+      <w:pPr>
+        <w:pStyle w:val="Heading3"/>
+        <w:spacing w:before="0"/>
+        <w:rPr>
+          <w:rFonts w:ascii="Times New Roman" w:hAnsi="Times New Roman" w:cs="Times New Roman"/>
+        </w:rPr>
+      </w:pPr>
+      <w:r>
+        <w:rPr>
+          <w:rStyle w:val="Strong"/>
+          <w:rFonts w:ascii="Times New Roman" w:hAnsi="Times New Roman" w:cs="Times New Roman"/>
+          <w:b w:val="0"/>
+          <w:bCs w:val="0"/>
+        </w:rPr>
+        <w:t xml:space="preserve">9. What is </w:t>
+      </w:r>
+      <w:proofErr w:type="spellStart"/>
+      <w:r>
+        <w:rPr>
+          <w:rStyle w:val="Strong"/>
+          <w:rFonts w:ascii="Times New Roman" w:hAnsi="Times New Roman" w:cs="Times New Roman"/>
+          <w:b w:val="0"/>
+          <w:bCs w:val="0"/>
+        </w:rPr>
+        <w:t>autoboxing</w:t>
+      </w:r>
+      <w:proofErr w:type="spellEnd"/>
+      <w:r>
+        <w:rPr>
+          <w:rStyle w:val="Strong"/>
+          <w:rFonts w:ascii="Times New Roman" w:hAnsi="Times New Roman" w:cs="Times New Roman"/>
+          <w:b w:val="0"/>
+          <w:bCs w:val="0"/>
+        </w:rPr>
+        <w:t xml:space="preserve"> in Java?</w:t>
+      </w:r>
+    </w:p>
+    <w:p>
+      <w:pPr>
+        <w:pStyle w:val="NormalWeb"/>
+        <w:spacing w:before="0" w:beforeAutospacing="0"/>
+        <w:ind w:left="360"/>
+      </w:pPr>
+      <w:r>
+        <w:t>a. Converting primitive → wrapper class object</w:t>
+      </w:r>
+      <w:r>
+        <w:br/>
+        <w:t>b. Wrapper → primitive</w:t>
+      </w:r>
+      <w:r>
+        <w:br/>
+        <w:t>c. Primitive → primitive</w:t>
+      </w:r>
+      <w:r>
+        <w:br/>
+        <w:t>d. Wrapper → wrapper</w:t>
+      </w:r>
+    </w:p>
+    <w:p>
+      <w:pPr>
+        <w:pStyle w:val="NormalWeb"/>
+        <w:rPr>
+          <w:color w:val="FF0000"/>
+        </w:rPr>
+      </w:pPr>
+      <w:r>
+        <w:rPr>
+          <w:rFonts w:ascii="Segoe UI Symbol" w:hAnsi="Segoe UI Symbol" w:cs="Segoe UI Symbol"/>
+          <w:color w:val="FF0000"/>
+        </w:rPr>
+        <w:t>✅</w:t>
+      </w:r>
+      <w:r>
+        <w:rPr>
+          <w:color w:val="FF0000"/>
+        </w:rPr>
+        <w:t xml:space="preserve"> </w:t>
+      </w:r>
+      <w:r>
+        <w:rPr>
+          <w:rStyle w:val="Strong"/>
+          <w:color w:val="FF0000"/>
+        </w:rPr>
+        <w:t>Answer: a. Converting primitive → wrapper class object</w:t>
+      </w:r>
+    </w:p>
+    <w:p>
+      <w:pPr>
+        <w:pStyle w:val="Heading3"/>
+        <w:spacing w:before="0"/>
+        <w:rPr>
+          <w:rFonts w:ascii="Times New Roman" w:hAnsi="Times New Roman" w:cs="Times New Roman"/>
+        </w:rPr>
+      </w:pPr>
+      <w:r>
+        <w:rPr>
+          <w:rStyle w:val="Strong"/>
+          <w:rFonts w:ascii="Times New Roman" w:hAnsi="Times New Roman" w:cs="Times New Roman"/>
+          <w:b w:val="0"/>
+          <w:bCs w:val="0"/>
+        </w:rPr>
+        <w:lastRenderedPageBreak/>
+        <w:t xml:space="preserve">10. Which of the following statements is true regarding </w:t>
+      </w:r>
+      <w:proofErr w:type="spellStart"/>
+      <w:r>
+        <w:rPr>
+          <w:rStyle w:val="Strong"/>
+          <w:rFonts w:ascii="Times New Roman" w:hAnsi="Times New Roman" w:cs="Times New Roman"/>
+          <w:b w:val="0"/>
+          <w:bCs w:val="0"/>
+        </w:rPr>
+        <w:t>autoboxing</w:t>
+      </w:r>
+      <w:proofErr w:type="spellEnd"/>
+      <w:r>
+        <w:rPr>
+          <w:rStyle w:val="Strong"/>
+          <w:rFonts w:ascii="Times New Roman" w:hAnsi="Times New Roman" w:cs="Times New Roman"/>
+          <w:b w:val="0"/>
+          <w:bCs w:val="0"/>
+        </w:rPr>
+        <w:t xml:space="preserve"> and unboxing?</w:t>
+      </w:r>
+    </w:p>
+    <w:p>
+      <w:pPr>
+        <w:pStyle w:val="NormalWeb"/>
+        <w:spacing w:before="0" w:beforeAutospacing="0"/>
+        <w:ind w:left="360"/>
+      </w:pPr>
+      <w:r>
+        <w:t xml:space="preserve">a. </w:t>
+      </w:r>
+      <w:proofErr w:type="spellStart"/>
+      <w:r>
+        <w:t>Autoboxing</w:t>
+      </w:r>
+      <w:proofErr w:type="spellEnd"/>
+      <w:r>
+        <w:t xml:space="preserve"> = wrapper → primitive</w:t>
+      </w:r>
+      <w:r>
+        <w:br/>
+        <w:t>b. Unboxing = wrapper → primitive</w:t>
+      </w:r>
+      <w:r>
+        <w:br/>
+        <w:t>c. Both same</w:t>
+      </w:r>
+      <w:r>
+        <w:br/>
+        <w:t>d. Not related</w:t>
+      </w:r>
+    </w:p>
+    <w:p>
+      <w:pPr>
+        <w:pStyle w:val="NormalWeb"/>
+        <w:rPr>
+          <w:color w:val="FF0000"/>
+        </w:rPr>
+      </w:pPr>
+      <w:r>
+        <w:rPr>
+          <w:rFonts w:ascii="Segoe UI Symbol" w:hAnsi="Segoe UI Symbol" w:cs="Segoe UI Symbol"/>
+          <w:color w:val="FF0000"/>
+        </w:rPr>
+        <w:t>✅</w:t>
+      </w:r>
+      <w:r>
+        <w:rPr>
+          <w:color w:val="FF0000"/>
+        </w:rPr>
+        <w:t xml:space="preserve"> </w:t>
+      </w:r>
+      <w:r>
+        <w:rPr>
+          <w:rStyle w:val="Strong"/>
+          <w:color w:val="FF0000"/>
+        </w:rPr>
+        <w:t>Answer: b. Unboxing = wrapper → primitive</w:t>
+      </w:r>
+    </w:p>
+    <w:p>
+      <w:pPr>
+        <w:pStyle w:val="NormalWeb"/>
+      </w:pPr>
+      <w:r>
+        <w:rPr>
+          <w:rFonts w:ascii="Segoe UI Symbol" w:hAnsi="Segoe UI Symbol" w:cs="Segoe UI Symbol"/>
+        </w:rPr>
+        <w:t>💡</w:t>
+      </w:r>
+      <w:r>
+        <w:t xml:space="preserve"> </w:t>
+      </w:r>
+      <w:r>
+        <w:rPr>
+          <w:rStyle w:val="Strong"/>
+        </w:rPr>
+        <w:t>Note:</w:t>
+      </w:r>
+    </w:p>
+    <w:p>
+      <w:pPr>
+        <w:numPr>
+          <w:ilvl w:val="0"/>
+          <w:numId w:val="15"/>
+        </w:numPr>
+        <w:spacing w:before="100" w:beforeAutospacing="1" w:after="100" w:afterAutospacing="1"/>
+      </w:pPr>
+      <w:proofErr w:type="spellStart"/>
+      <w:r>
+        <w:t>Autoboxing</w:t>
+      </w:r>
+      <w:proofErr w:type="spellEnd"/>
+      <w:r>
+        <w:t xml:space="preserve"> = primitive → object </w:t>
+      </w:r>
+    </w:p>
+    <w:p>
+      <w:pPr>
+        <w:numPr>
+          <w:ilvl w:val="0"/>
+          <w:numId w:val="15"/>
+        </w:numPr>
+        <w:spacing w:before="100" w:beforeAutospacing="1" w:after="100" w:afterAutospacing="1"/>
+      </w:pPr>
+      <w:r>
+        <w:t xml:space="preserve">Unboxing = object → primitive </w:t>
+      </w:r>
+    </w:p>
+    <w:p>
+      <w:r>
+        <w:pict>
+          <v:rect id="_x0000_i1026" style="width:0;height:1.5pt" o:hralign="center" o:hrstd="t" o:hr="t" fillcolor="#a0a0a0" stroked="f"/>
+        </w:pict>
+      </w:r>
+    </w:p>
+    <w:p>
+      <w:pPr>
+        <w:pStyle w:val="Heading1"/>
+        <w:rPr>
+          <w:rFonts w:ascii="Times New Roman" w:hAnsi="Times New Roman" w:cs="Times New Roman"/>
+          <w:sz w:val="36"/>
+        </w:rPr>
+      </w:pPr>
+      <w:r>
+        <w:rPr>
+          <w:rFonts w:ascii="Segoe UI Symbol" w:hAnsi="Segoe UI Symbol" w:cs="Segoe UI Symbol"/>
+          <w:sz w:val="36"/>
+        </w:rPr>
+        <w:t>✅</w:t>
+      </w:r>
+      <w:r>
+        <w:rPr>
+          <w:rFonts w:ascii="Times New Roman" w:hAnsi="Times New Roman" w:cs="Times New Roman"/>
+          <w:sz w:val="36"/>
+        </w:rPr>
+        <w:t xml:space="preserve"> </w:t>
+      </w:r>
+      <w:r>
+        <w:rPr>
+          <w:rStyle w:val="Strong"/>
+          <w:rFonts w:ascii="Times New Roman" w:hAnsi="Times New Roman" w:cs="Times New Roman"/>
+          <w:bCs w:val="0"/>
+          <w:sz w:val="36"/>
+        </w:rPr>
+        <w:t>Fill in the Blanks</w:t>
+      </w:r>
+    </w:p>
+    <w:p>
+      <w:r>
+        <w:pict>
+          <v:rect id="_x0000_i1025" style="width:0;height:1.5pt" o:hralign="center" o:hrstd="t" o:hr="t" fillcolor="#a0a0a0" stroked="f"/>
+        </w:pict>
+      </w:r>
+    </w:p>
+    <w:p>
+      <w:pPr>
+        <w:pStyle w:val="Heading3"/>
+        <w:spacing w:before="0"/>
+        <w:rPr>
+          <w:rFonts w:ascii="Times New Roman" w:hAnsi="Times New Roman" w:cs="Times New Roman"/>
+        </w:rPr>
+      </w:pPr>
+      <w:r>
+        <w:rPr>
+          <w:rStyle w:val="Strong"/>
+          <w:rFonts w:ascii="Times New Roman" w:hAnsi="Times New Roman" w:cs="Times New Roman"/>
+          <w:b w:val="0"/>
+          <w:bCs w:val="0"/>
+        </w:rPr>
+        <w:t>1. The protected members of a class can be accessed outside the package by using the __________</w:t>
+      </w:r>
+    </w:p>
+    <w:p>
+      <w:pPr>
+        <w:pStyle w:val="NormalWeb"/>
+        <w:spacing w:before="0" w:beforeAutospacing="0"/>
+        <w:rPr>
+          <w:color w:val="FF0000"/>
+        </w:rPr>
+      </w:pPr>
+      <w:r>
+        <w:rPr>
+          <w:rFonts w:ascii="Segoe UI Symbol" w:hAnsi="Segoe UI Symbol" w:cs="Segoe UI Symbol"/>
+          <w:color w:val="FF0000"/>
+        </w:rPr>
+        <w:t>✅</w:t>
+      </w:r>
+      <w:r>
+        <w:rPr>
+          <w:color w:val="FF0000"/>
+        </w:rPr>
+        <w:t xml:space="preserve"> </w:t>
+      </w:r>
+      <w:r>
+        <w:rPr>
+          <w:rStyle w:val="Strong"/>
+          <w:color w:val="FF0000"/>
+        </w:rPr>
+        <w:t>Answer: subclass</w:t>
+      </w:r>
+    </w:p>
+    <w:p>
+      <w:pPr>
+        <w:pStyle w:val="Heading3"/>
+        <w:spacing w:before="0"/>
+        <w:rPr>
+          <w:rFonts w:ascii="Times New Roman" w:hAnsi="Times New Roman" w:cs="Times New Roman"/>
+        </w:rPr>
+      </w:pPr>
+      <w:r>
+        <w:rPr>
+          <w:rStyle w:val="Strong"/>
+          <w:rFonts w:ascii="Times New Roman" w:hAnsi="Times New Roman" w:cs="Times New Roman"/>
+          <w:b w:val="0"/>
+          <w:bCs w:val="0"/>
+        </w:rPr>
+        <w:t>2. __________ helps to reduce the program code and makes easier to debug any error in the program.</w:t>
+      </w:r>
+    </w:p>
+    <w:p>
+      <w:pPr>
+        <w:pStyle w:val="NormalWeb"/>
+        <w:spacing w:before="0" w:beforeAutospacing="0"/>
+        <w:rPr>
+          <w:color w:val="FF0000"/>
+        </w:rPr>
+      </w:pPr>
+      <w:r>
+        <w:rPr>
+          <w:rFonts w:ascii="Segoe UI Symbol" w:hAnsi="Segoe UI Symbol" w:cs="Segoe UI Symbol"/>
+          <w:color w:val="FF0000"/>
+        </w:rPr>
+        <w:t>✅</w:t>
+      </w:r>
+      <w:r>
+        <w:rPr>
+          <w:color w:val="FF0000"/>
+        </w:rPr>
+        <w:t xml:space="preserve"> </w:t>
+      </w:r>
+      <w:r>
+        <w:rPr>
+          <w:rStyle w:val="Strong"/>
+          <w:color w:val="FF0000"/>
+        </w:rPr>
+        <w:t>Answer: Inheritance</w:t>
+      </w:r>
+    </w:p>
+    <w:p>
+      <w:pPr>
+        <w:pStyle w:val="Heading3"/>
+        <w:spacing w:before="0"/>
+        <w:rPr>
+          <w:rFonts w:ascii="Times New Roman" w:hAnsi="Times New Roman" w:cs="Times New Roman"/>
+        </w:rPr>
+      </w:pPr>
+      <w:r>
+        <w:rPr>
+          <w:rStyle w:val="Strong"/>
+          <w:rFonts w:ascii="Times New Roman" w:hAnsi="Times New Roman" w:cs="Times New Roman"/>
+          <w:b w:val="0"/>
+          <w:bCs w:val="0"/>
+        </w:rPr>
+        <w:t>3. When the derived class is inherited from more than one superclass, then the type of inheritance is termed as __________</w:t>
+      </w:r>
+    </w:p>
+    <w:p>
+      <w:pPr>
+        <w:pStyle w:val="NormalWeb"/>
+        <w:spacing w:before="0" w:beforeAutospacing="0"/>
+        <w:rPr>
+          <w:color w:val="FF0000"/>
+        </w:rPr>
+      </w:pPr>
+      <w:r>
+        <w:rPr>
+          <w:rFonts w:ascii="Segoe UI Symbol" w:hAnsi="Segoe UI Symbol" w:cs="Segoe UI Symbol"/>
+          <w:color w:val="FF0000"/>
+        </w:rPr>
+        <w:t>✅</w:t>
+      </w:r>
+      <w:r>
+        <w:rPr>
+          <w:color w:val="FF0000"/>
+        </w:rPr>
+        <w:t xml:space="preserve"> </w:t>
+      </w:r>
+      <w:r>
+        <w:rPr>
+          <w:rStyle w:val="Strong"/>
+          <w:color w:val="FF0000"/>
+        </w:rPr>
+        <w:t>Answer: Multiple inheritance</w:t>
+      </w:r>
+    </w:p>
+    <w:p>
+      <w:pPr>
+        <w:pStyle w:val="Heading3"/>
+        <w:spacing w:before="0"/>
+        <w:rPr>
+          <w:rFonts w:ascii="Times New Roman" w:hAnsi="Times New Roman" w:cs="Times New Roman"/>
+        </w:rPr>
+      </w:pPr>
+      <w:r>
+        <w:rPr>
+          <w:rStyle w:val="Strong"/>
+          <w:rFonts w:ascii="Times New Roman" w:hAnsi="Times New Roman" w:cs="Times New Roman"/>
+          <w:b w:val="0"/>
+          <w:bCs w:val="0"/>
+        </w:rPr>
+        <w:t>4. Derived class is also known as __________ class.</w:t>
+      </w:r>
+    </w:p>
+    <w:p>
+      <w:pPr>
+        <w:pStyle w:val="NormalWeb"/>
+        <w:spacing w:before="0" w:beforeAutospacing="0"/>
+        <w:rPr>
+          <w:color w:val="FF0000"/>
+        </w:rPr>
+      </w:pPr>
+      <w:r>
+        <w:rPr>
+          <w:rFonts w:ascii="Segoe UI Symbol" w:hAnsi="Segoe UI Symbol" w:cs="Segoe UI Symbol"/>
+          <w:color w:val="FF0000"/>
+        </w:rPr>
+        <w:t>✅</w:t>
+      </w:r>
+      <w:r>
+        <w:rPr>
+          <w:color w:val="FF0000"/>
+        </w:rPr>
+        <w:t xml:space="preserve"> </w:t>
+      </w:r>
+      <w:r>
+        <w:rPr>
+          <w:rStyle w:val="Strong"/>
+          <w:color w:val="FF0000"/>
+        </w:rPr>
+        <w:t>Answer: Subclass</w:t>
+      </w:r>
+    </w:p>
+    <w:p>
+      <w:pPr>
+        <w:pStyle w:val="Heading1"/>
+        <w:rPr>
+          <w:rFonts w:ascii="Times New Roman" w:hAnsi="Times New Roman" w:cs="Times New Roman"/>
+          <w:sz w:val="36"/>
+        </w:rPr>
+      </w:pPr>
+      <w:r>
+        <w:rPr>
+          <w:rFonts w:ascii="Segoe UI Symbol" w:hAnsi="Segoe UI Symbol" w:cs="Segoe UI Symbol"/>
+          <w:sz w:val="36"/>
+        </w:rPr>
+        <w:t>✅</w:t>
+      </w:r>
+      <w:r>
+        <w:rPr>
+          <w:rFonts w:ascii="Times New Roman" w:hAnsi="Times New Roman" w:cs="Times New Roman"/>
+          <w:sz w:val="36"/>
+        </w:rPr>
+        <w:t xml:space="preserve"> </w:t>
+      </w:r>
+      <w:r>
+        <w:rPr>
+          <w:rStyle w:val="Strong"/>
+          <w:rFonts w:ascii="Times New Roman" w:hAnsi="Times New Roman" w:cs="Times New Roman"/>
+          <w:bCs w:val="0"/>
+          <w:sz w:val="36"/>
+        </w:rPr>
+        <w:t>Assertion and Reasoning</w:t>
+      </w:r>
+    </w:p>
+    <w:p>
+      <w:pPr>
+        <w:pStyle w:val="NormalWeb"/>
+      </w:pPr>
+      <w:r>
+        <w:t>Options</w:t>
+      </w:r>
+      <w:proofErr w:type="gramStart"/>
+      <w:r>
+        <w:t>:</w:t>
+      </w:r>
+      <w:proofErr w:type="gramEnd"/>
+      <w:r>
+        <w:br/>
+        <w:t>a. Both A and R true, R explains A</w:t>
+      </w:r>
+      <w:r>
+        <w:br/>
+        <w:t>b. Both true, but R not explanation</w:t>
+      </w:r>
+      <w:r>
+        <w:br/>
+        <w:t>c. A true, R false</w:t>
+      </w:r>
+      <w:r>
+        <w:br/>
+        <w:t>d. A false, R true</w:t>
+      </w:r>
+    </w:p>
+    <w:p>
+      <w:pPr>
+        <w:pStyle w:val="Heading3"/>
+        <w:rPr>
+          <w:rFonts w:ascii="Times New Roman" w:hAnsi="Times New Roman" w:cs="Times New Roman"/>
+        </w:rPr>
+      </w:pPr>
+      <w:r>
+        <w:rPr>
+          <w:rStyle w:val="Strong"/>
+          <w:rFonts w:ascii="Times New Roman" w:hAnsi="Times New Roman" w:cs="Times New Roman"/>
+          <w:b w:val="0"/>
+          <w:bCs w:val="0"/>
+        </w:rPr>
+        <w:t>1.</w:t>
+      </w:r>
+    </w:p>
+    <w:p>
+      <w:pPr>
+        <w:pStyle w:val="NormalWeb"/>
+      </w:pPr>
+      <w:r>
+        <w:t xml:space="preserve">Assertion: </w:t>
+      </w:r>
+      <w:proofErr w:type="spellStart"/>
+      <w:proofErr w:type="gramStart"/>
+      <w:r>
+        <w:t>Character.isLetter</w:t>
+      </w:r>
+      <w:proofErr w:type="spellEnd"/>
+      <w:r>
+        <w:t>(</w:t>
+      </w:r>
+      <w:proofErr w:type="gramEnd"/>
+      <w:r>
+        <w:t>) is a wrapper class method</w:t>
+      </w:r>
+      <w:r>
+        <w:br/>
+        <w:t>Reason: It checks whether character is digit</w:t>
+      </w:r>
+    </w:p>
+    <w:p>
+      <w:pPr>
+        <w:pStyle w:val="NormalWeb"/>
+      </w:pPr>
+      <w:r>
+        <w:rPr>
+          <w:rFonts w:ascii="Segoe UI Symbol" w:hAnsi="Segoe UI Symbol" w:cs="Segoe UI Symbol"/>
+        </w:rPr>
+        <w:t>✅</w:t>
+      </w:r>
+      <w:r>
+        <w:t xml:space="preserve"> </w:t>
+      </w:r>
+      <w:r>
+        <w:rPr>
+          <w:rStyle w:val="Strong"/>
+        </w:rPr>
+        <w:t>Answer: c. A is true, R is false</w:t>
+      </w:r>
+    </w:p>
+    <w:p>
+      <w:pPr>
+        <w:pStyle w:val="Heading3"/>
+        <w:rPr>
+          <w:rFonts w:ascii="Times New Roman" w:hAnsi="Times New Roman" w:cs="Times New Roman"/>
+        </w:rPr>
+      </w:pPr>
+      <w:r>
+        <w:rPr>
+          <w:rStyle w:val="Strong"/>
+          <w:rFonts w:ascii="Times New Roman" w:hAnsi="Times New Roman" w:cs="Times New Roman"/>
+          <w:b w:val="0"/>
+          <w:bCs w:val="0"/>
+        </w:rPr>
+        <w:lastRenderedPageBreak/>
+        <w:t>2.</w:t>
+      </w:r>
+    </w:p>
+    <w:p>
+      <w:pPr>
+        <w:pStyle w:val="NormalWeb"/>
+      </w:pPr>
+      <w:r>
+        <w:t xml:space="preserve">Assertion: </w:t>
+      </w:r>
+      <w:proofErr w:type="spellStart"/>
+      <w:proofErr w:type="gramStart"/>
+      <w:r>
+        <w:t>Character.toUpperCase</w:t>
+      </w:r>
+      <w:proofErr w:type="spellEnd"/>
+      <w:r>
+        <w:t>(</w:t>
+      </w:r>
+      <w:proofErr w:type="spellStart"/>
+      <w:proofErr w:type="gramEnd"/>
+      <w:r>
+        <w:t>ch</w:t>
+      </w:r>
+      <w:proofErr w:type="spellEnd"/>
+      <w:r>
+        <w:t>) converts to uppercase</w:t>
+      </w:r>
+      <w:r>
+        <w:br/>
+        <w:t>Reason: If already uppercase → no change</w:t>
+      </w:r>
+    </w:p>
+    <w:p>
+      <w:pPr>
+        <w:pStyle w:val="NormalWeb"/>
+      </w:pPr>
+      <w:r>
+        <w:rPr>
+          <w:rFonts w:ascii="Segoe UI Symbol" w:hAnsi="Segoe UI Symbol" w:cs="Segoe UI Symbol"/>
+        </w:rPr>
+        <w:t>✅</w:t>
+      </w:r>
+      <w:r>
+        <w:t xml:space="preserve"> </w:t>
+      </w:r>
+      <w:r>
+        <w:rPr>
+          <w:rStyle w:val="Strong"/>
+        </w:rPr>
+        <w:t xml:space="preserve">Answer: a. </w:t>
+      </w:r>
+      <w:proofErr w:type="gramStart"/>
+      <w:r>
+        <w:rPr>
+          <w:rStyle w:val="Strong"/>
+        </w:rPr>
+        <w:t>Both</w:t>
+      </w:r>
+      <w:proofErr w:type="gramEnd"/>
+      <w:r>
+        <w:rPr>
+          <w:rStyle w:val="Strong"/>
+        </w:rPr>
+        <w:t xml:space="preserve"> true and correct explanation</w:t>
+      </w:r>
+    </w:p>
+    <w:p>
+      <w:pPr>
+        <w:pStyle w:val="Heading3"/>
+        <w:rPr>
+          <w:rFonts w:ascii="Times New Roman" w:hAnsi="Times New Roman" w:cs="Times New Roman"/>
+        </w:rPr>
+      </w:pPr>
+      <w:r>
+        <w:rPr>
+          <w:rStyle w:val="Strong"/>
+          <w:rFonts w:ascii="Times New Roman" w:hAnsi="Times New Roman" w:cs="Times New Roman"/>
+          <w:b w:val="0"/>
+          <w:bCs w:val="0"/>
+        </w:rPr>
+        <w:t>3.</w:t>
+      </w:r>
+    </w:p>
+    <w:p>
+      <w:pPr>
+        <w:pStyle w:val="NormalWeb"/>
+      </w:pPr>
+      <w:r>
+        <w:t xml:space="preserve">Assertion: </w:t>
+      </w:r>
+      <w:proofErr w:type="spellStart"/>
+      <w:proofErr w:type="gramStart"/>
+      <w:r>
+        <w:t>Integer.parseInt</w:t>
+      </w:r>
+      <w:proofErr w:type="spellEnd"/>
+      <w:r>
+        <w:t>(</w:t>
+      </w:r>
+      <w:proofErr w:type="gramEnd"/>
+      <w:r>
+        <w:t>String) converts integer to string</w:t>
+      </w:r>
+      <w:r>
+        <w:br/>
+        <w:t>Reason: Integer is a wrapper class</w:t>
+      </w:r>
+    </w:p>
+    <w:p>
+      <w:pPr>
+        <w:pStyle w:val="NormalWeb"/>
+      </w:pPr>
+      <w:r>
+        <w:rPr>
+          <w:rFonts w:ascii="Segoe UI Symbol" w:hAnsi="Segoe UI Symbol" w:cs="Segoe UI Symbol"/>
+        </w:rPr>
+        <w:t>✅</w:t>
+      </w:r>
+      <w:r>
+        <w:t xml:space="preserve"> </w:t>
+      </w:r>
+      <w:r>
+        <w:rPr>
+          <w:rStyle w:val="Strong"/>
+        </w:rPr>
+        <w:t>Answer: d. A is false, R is true</w:t>
+      </w:r>
+    </w:p>
+    <w:p>
+      <w:pPr>
+        <w:pStyle w:val="NormalWeb"/>
+      </w:pPr>
+      <w:r>
+        <w:rPr>
+          <w:rFonts w:ascii="Segoe UI Symbol" w:hAnsi="Segoe UI Symbol" w:cs="Segoe UI Symbol"/>
+        </w:rPr>
+        <w:t>💡</w:t>
+      </w:r>
+      <w:r>
+        <w:t xml:space="preserve"> </w:t>
+      </w:r>
+      <w:proofErr w:type="spellStart"/>
+      <w:proofErr w:type="gramStart"/>
+      <w:r>
+        <w:t>parseInt</w:t>
+      </w:r>
+      <w:proofErr w:type="spellEnd"/>
+      <w:proofErr w:type="gramEnd"/>
+      <w:r>
+        <w:t xml:space="preserve"> converts </w:t>
+      </w:r>
+      <w:r>
+        <w:rPr>
+          <w:rStyle w:val="Strong"/>
+        </w:rPr>
+        <w:t xml:space="preserve">String → </w:t>
+      </w:r>
+      <w:proofErr w:type="spellStart"/>
+      <w:r>
+        <w:rPr>
+          <w:rStyle w:val="Strong"/>
+        </w:rPr>
+        <w:t>int</w:t>
+      </w:r>
+      <w:proofErr w:type="spellEnd"/>
+    </w:p>
+    <w:p>
+      <w:pPr>
+        <w:pStyle w:val="Heading1"/>
+        <w:rPr>
+          <w:rFonts w:ascii="Times New Roman" w:hAnsi="Times New Roman" w:cs="Times New Roman"/>
+          <w:sz w:val="36"/>
+          <w:szCs w:val="36"/>
+        </w:rPr>
+      </w:pPr>
+      <w:r>
+        <w:rPr>
+          <w:rFonts w:ascii="Segoe UI Symbol" w:hAnsi="Segoe UI Symbol" w:cs="Segoe UI Symbol"/>
+          <w:sz w:val="36"/>
+          <w:szCs w:val="36"/>
+        </w:rPr>
+        <w:t>✅</w:t>
+      </w:r>
+      <w:r>
+        <w:rPr>
+          <w:rFonts w:ascii="Times New Roman" w:hAnsi="Times New Roman" w:cs="Times New Roman"/>
+          <w:sz w:val="36"/>
+          <w:szCs w:val="36"/>
+        </w:rPr>
+        <w:t xml:space="preserve"> </w:t>
+      </w:r>
+      <w:r>
+        <w:rPr>
+          <w:rStyle w:val="Strong"/>
+          <w:rFonts w:ascii="Times New Roman" w:hAnsi="Times New Roman" w:cs="Times New Roman"/>
+          <w:bCs w:val="0"/>
+          <w:sz w:val="36"/>
+          <w:szCs w:val="36"/>
+        </w:rPr>
+        <w:t>Case-Based Questions</w:t>
+      </w:r>
+    </w:p>
+    <w:p>
+      <w:pPr>
+        <w:pStyle w:val="Heading3"/>
+        <w:rPr>
+          <w:rFonts w:ascii="Times New Roman" w:hAnsi="Times New Roman" w:cs="Times New Roman"/>
+        </w:rPr>
+      </w:pPr>
+      <w:proofErr w:type="spellStart"/>
+      <w:r>
+        <w:rPr>
+          <w:rStyle w:val="Strong"/>
+          <w:rFonts w:ascii="Times New Roman" w:hAnsi="Times New Roman" w:cs="Times New Roman"/>
+          <w:b w:val="0"/>
+          <w:bCs w:val="0"/>
+        </w:rPr>
+        <w:t>i</w:t>
+      </w:r>
+      <w:proofErr w:type="spellEnd"/>
+      <w:r>
+        <w:rPr>
+          <w:rStyle w:val="Strong"/>
+          <w:rFonts w:ascii="Times New Roman" w:hAnsi="Times New Roman" w:cs="Times New Roman"/>
+          <w:b w:val="0"/>
+          <w:bCs w:val="0"/>
+        </w:rPr>
+        <w:t>. Which statement is correct?</w:t>
+      </w:r>
+    </w:p>
+    <w:p>
+      <w:pPr>
+        <w:pStyle w:val="NormalWeb"/>
+      </w:pPr>
+      <w:r>
+        <w:t xml:space="preserve">Statement 1: </w:t>
+      </w:r>
+      <w:proofErr w:type="spellStart"/>
+      <w:proofErr w:type="gramStart"/>
+      <w:r>
+        <w:t>String.valueOf</w:t>
+      </w:r>
+      <w:proofErr w:type="spellEnd"/>
+      <w:r>
+        <w:t>(</w:t>
+      </w:r>
+      <w:proofErr w:type="gramEnd"/>
+      <w:r>
+        <w:t>) only converts primitive types</w:t>
+      </w:r>
+      <w:r>
+        <w:br/>
+        <w:t xml:space="preserve">Statement 2: </w:t>
+      </w:r>
+      <w:proofErr w:type="spellStart"/>
+      <w:r>
+        <w:t>toString</w:t>
+      </w:r>
+      <w:proofErr w:type="spellEnd"/>
+      <w:r>
+        <w:t>() converts primitive types</w:t>
+      </w:r>
+    </w:p>
+    <w:p>
+      <w:pPr>
+        <w:pStyle w:val="NormalWeb"/>
+      </w:pPr>
+      <w:r>
+        <w:t>Options</w:t>
+      </w:r>
+      <w:proofErr w:type="gramStart"/>
+      <w:r>
+        <w:t>:</w:t>
+      </w:r>
+      <w:proofErr w:type="gramEnd"/>
+      <w:r>
+        <w:br/>
+        <w:t>a. S1 true, S2 false</w:t>
+      </w:r>
+      <w:r>
+        <w:br/>
+        <w:t>b. S1 false, S2 true</w:t>
+      </w:r>
+      <w:r>
+        <w:br/>
+        <w:t>c. Both true</w:t>
+      </w:r>
+      <w:r>
+        <w:br/>
+        <w:t>d. Both false</w:t>
+      </w:r>
+    </w:p>
+    <w:p>
+      <w:pPr>
+        <w:pStyle w:val="NormalWeb"/>
+      </w:pPr>
+      <w:r>
+        <w:rPr>
+          <w:rFonts w:ascii="Segoe UI Symbol" w:hAnsi="Segoe UI Symbol" w:cs="Segoe UI Symbol"/>
+        </w:rPr>
+        <w:t>✅</w:t>
+      </w:r>
+      <w:r>
+        <w:t xml:space="preserve"> </w:t>
+      </w:r>
+      <w:r>
+        <w:rPr>
+          <w:rStyle w:val="Strong"/>
+        </w:rPr>
+        <w:t>Answer: b. Statement 1 false, Statement 2 true</w:t>
+      </w:r>
+    </w:p>
+    <w:p>
+      <w:pPr>
+        <w:pStyle w:val="Heading3"/>
+        <w:rPr>
+          <w:rFonts w:ascii="Times New Roman" w:hAnsi="Times New Roman" w:cs="Times New Roman"/>
+        </w:rPr>
+      </w:pPr>
+      <w:r>
+        <w:rPr>
+          <w:rStyle w:val="Strong"/>
+          <w:rFonts w:ascii="Times New Roman" w:hAnsi="Times New Roman" w:cs="Times New Roman"/>
+          <w:b w:val="0"/>
+          <w:bCs w:val="0"/>
+        </w:rPr>
+        <w:t xml:space="preserve">ii. What does </w:t>
+      </w:r>
+      <w:proofErr w:type="spellStart"/>
+      <w:proofErr w:type="gramStart"/>
+      <w:r>
+        <w:rPr>
+          <w:rStyle w:val="Strong"/>
+          <w:rFonts w:ascii="Times New Roman" w:hAnsi="Times New Roman" w:cs="Times New Roman"/>
+          <w:b w:val="0"/>
+          <w:bCs w:val="0"/>
+        </w:rPr>
+        <w:t>String.valueOf</w:t>
+      </w:r>
+      <w:proofErr w:type="spellEnd"/>
+      <w:r>
+        <w:rPr>
+          <w:rStyle w:val="Strong"/>
+          <w:rFonts w:ascii="Times New Roman" w:hAnsi="Times New Roman" w:cs="Times New Roman"/>
+          <w:b w:val="0"/>
+          <w:bCs w:val="0"/>
+        </w:rPr>
+        <w:t>(</w:t>
+      </w:r>
+      <w:proofErr w:type="gramEnd"/>
+      <w:r>
+        <w:rPr>
+          <w:rStyle w:val="Strong"/>
+          <w:rFonts w:ascii="Times New Roman" w:hAnsi="Times New Roman" w:cs="Times New Roman"/>
+          <w:b w:val="0"/>
+          <w:bCs w:val="0"/>
+        </w:rPr>
+        <w:t>) do?</w:t>
+      </w:r>
+    </w:p>
+    <w:p>
+      <w:pPr>
+        <w:pStyle w:val="NormalWeb"/>
+      </w:pPr>
+      <w:r>
+        <w:t>a. String → primitive</w:t>
+      </w:r>
+      <w:r>
+        <w:br/>
+        <w:t>b. Primitive → string</w:t>
+      </w:r>
+      <w:r>
+        <w:br/>
+        <w:t>c. Wrapper → primitive</w:t>
+      </w:r>
+      <w:r>
+        <w:br/>
+        <w:t>d. Primitive → wrapper</w:t>
+      </w:r>
+    </w:p>
+    <w:p>
+      <w:pPr>
+        <w:pStyle w:val="NormalWeb"/>
+      </w:pPr>
+      <w:r>
+        <w:rPr>
+          <w:rFonts w:ascii="Segoe UI Symbol" w:hAnsi="Segoe UI Symbol" w:cs="Segoe UI Symbol"/>
+        </w:rPr>
+        <w:t>✅</w:t>
+      </w:r>
+      <w:r>
+        <w:t xml:space="preserve"> </w:t>
+      </w:r>
+      <w:r>
+        <w:rPr>
+          <w:rStyle w:val="Strong"/>
+        </w:rPr>
+        <w:t>Answer: b. Primitive → string</w:t>
+      </w:r>
+    </w:p>
+    <w:p>
+      <w:pPr>
+        <w:pStyle w:val="Heading3"/>
+        <w:rPr>
+          <w:rFonts w:ascii="Times New Roman" w:hAnsi="Times New Roman" w:cs="Times New Roman"/>
+        </w:rPr>
+      </w:pPr>
+      <w:r>
+        <w:rPr>
+          <w:rStyle w:val="Strong"/>
+          <w:rFonts w:ascii="Times New Roman" w:hAnsi="Times New Roman" w:cs="Times New Roman"/>
+          <w:b w:val="0"/>
+          <w:bCs w:val="0"/>
+        </w:rPr>
+        <w:t>iii. Which method converts values to string?</w:t>
+      </w:r>
+    </w:p>
+    <w:p>
+      <w:pPr>
+        <w:pStyle w:val="NormalWeb"/>
+      </w:pPr>
+      <w:proofErr w:type="gramStart"/>
+      <w:r>
+        <w:t>a</w:t>
+      </w:r>
+      <w:proofErr w:type="gramEnd"/>
+      <w:r>
+        <w:t xml:space="preserve">. </w:t>
+      </w:r>
+      <w:proofErr w:type="spellStart"/>
+      <w:r>
+        <w:t>toString</w:t>
+      </w:r>
+      <w:proofErr w:type="spellEnd"/>
+      <w:r>
+        <w:t>()</w:t>
+      </w:r>
+      <w:r>
+        <w:br/>
+        <w:t xml:space="preserve">b. </w:t>
+      </w:r>
+      <w:proofErr w:type="spellStart"/>
+      <w:r>
+        <w:t>valueOf</w:t>
+      </w:r>
+      <w:proofErr w:type="spellEnd"/>
+      <w:r>
+        <w:t>()</w:t>
+      </w:r>
+      <w:r>
+        <w:br/>
+        <w:t xml:space="preserve">c. </w:t>
+      </w:r>
+      <w:proofErr w:type="spellStart"/>
+      <w:r>
+        <w:t>getString</w:t>
+      </w:r>
+      <w:proofErr w:type="spellEnd"/>
+      <w:r>
+        <w:t>()</w:t>
+      </w:r>
+      <w:r>
+        <w:br/>
+        <w:t xml:space="preserve">d. </w:t>
+      </w:r>
+      <w:proofErr w:type="spellStart"/>
+      <w:r>
+        <w:t>parseString</w:t>
+      </w:r>
+      <w:proofErr w:type="spellEnd"/>
+      <w:r>
+        <w:t>()</w:t>
+      </w:r>
+    </w:p>
+    <w:p>
+      <w:pPr>
+        <w:pStyle w:val="NormalWeb"/>
+      </w:pPr>
+      <w:r>
+        <w:rPr>
+          <w:rFonts w:ascii="Segoe UI Symbol" w:hAnsi="Segoe UI Symbol" w:cs="Segoe UI Symbol"/>
+        </w:rPr>
+        <w:t>✅</w:t>
+      </w:r>
+      <w:r>
+        <w:t xml:space="preserve"> </w:t>
+      </w:r>
+      <w:r>
+        <w:rPr>
+          <w:rStyle w:val="Strong"/>
+        </w:rPr>
+        <w:t xml:space="preserve">Answer: b. </w:t>
+      </w:r>
+      <w:proofErr w:type="spellStart"/>
+      <w:proofErr w:type="gramStart"/>
+      <w:r>
+        <w:rPr>
+          <w:rStyle w:val="Strong"/>
+        </w:rPr>
+        <w:t>valueOf</w:t>
+      </w:r>
+      <w:proofErr w:type="spellEnd"/>
+      <w:r>
+        <w:rPr>
+          <w:rStyle w:val="Strong"/>
+        </w:rPr>
+        <w:t>()</w:t>
+      </w:r>
+      <w:proofErr w:type="gramEnd"/>
+    </w:p>
+    <w:p>
+      <w:pPr>
+        <w:pStyle w:val="Heading1"/>
+        <w:rPr>
+          <w:rFonts w:ascii="Times New Roman" w:hAnsi="Times New Roman" w:cs="Times New Roman"/>
+          <w:sz w:val="36"/>
+          <w:szCs w:val="36"/>
+        </w:rPr>
+      </w:pPr>
+      <w:bookmarkStart w:id="0" w:name="_GoBack"/>
+      <w:r>
+        <w:rPr>
+          <w:rFonts w:ascii="Segoe UI Symbol" w:hAnsi="Segoe UI Symbol" w:cs="Segoe UI Symbol"/>
+          <w:sz w:val="36"/>
+          <w:szCs w:val="36"/>
+        </w:rPr>
+        <w:lastRenderedPageBreak/>
+        <w:t>✅</w:t>
+      </w:r>
+      <w:r>
+        <w:rPr>
+          <w:rFonts w:ascii="Times New Roman" w:hAnsi="Times New Roman" w:cs="Times New Roman"/>
+          <w:sz w:val="36"/>
+          <w:szCs w:val="36"/>
+        </w:rPr>
+        <w:t xml:space="preserve"> </w:t>
+      </w:r>
+      <w:r>
+        <w:rPr>
+          <w:rStyle w:val="Strong"/>
+          <w:rFonts w:ascii="Times New Roman" w:hAnsi="Times New Roman" w:cs="Times New Roman"/>
+          <w:bCs w:val="0"/>
+          <w:sz w:val="36"/>
+          <w:szCs w:val="36"/>
+        </w:rPr>
+        <w:t>Program Based Question</w:t>
+      </w:r>
+    </w:p>
+    <w:bookmarkEnd w:id="0"/>
+    <w:p>
+      <w:pPr>
+        <w:pStyle w:val="HTMLPreformatted"/>
+        <w:rPr>
+          <w:rFonts w:ascii="Times New Roman" w:hAnsi="Times New Roman" w:cs="Times New Roman"/>
+        </w:rPr>
+      </w:pPr>
+      <w:proofErr w:type="spellStart"/>
+      <w:proofErr w:type="gramStart"/>
+      <w:r>
+        <w:rPr>
+          <w:rFonts w:ascii="Times New Roman" w:hAnsi="Times New Roman" w:cs="Times New Roman"/>
+        </w:rPr>
+        <w:t>int</w:t>
+      </w:r>
+      <w:proofErr w:type="spellEnd"/>
+      <w:proofErr w:type="gramEnd"/>
+      <w:r>
+        <w:rPr>
+          <w:rFonts w:ascii="Times New Roman" w:hAnsi="Times New Roman" w:cs="Times New Roman"/>
+        </w:rPr>
+        <w:t xml:space="preserve"> value = 123456789L;</w:t>
+      </w:r>
+      <w:r>
+        <w:rPr>
+          <w:rFonts w:ascii="Times New Roman" w:hAnsi="Times New Roman" w:cs="Times New Roman"/>
+        </w:rPr>
+        <w:br/>
+        <w:t xml:space="preserve">String </w:t>
+      </w:r>
+      <w:proofErr w:type="spellStart"/>
+      <w:r>
+        <w:rPr>
+          <w:rFonts w:ascii="Times New Roman" w:hAnsi="Times New Roman" w:cs="Times New Roman"/>
+        </w:rPr>
+        <w:t>str</w:t>
+      </w:r>
+      <w:proofErr w:type="spellEnd"/>
+      <w:r>
+        <w:rPr>
+          <w:rFonts w:ascii="Times New Roman" w:hAnsi="Times New Roman" w:cs="Times New Roman"/>
+        </w:rPr>
+        <w:t xml:space="preserve"> = </w:t>
+      </w:r>
+      <w:proofErr w:type="spellStart"/>
+      <w:r>
+        <w:rPr>
+          <w:rFonts w:ascii="Times New Roman" w:hAnsi="Times New Roman" w:cs="Times New Roman"/>
+        </w:rPr>
+        <w:t>String.valueOf</w:t>
+      </w:r>
+      <w:proofErr w:type="spellEnd"/>
+      <w:r>
+        <w:rPr>
+          <w:rFonts w:ascii="Times New Roman" w:hAnsi="Times New Roman" w:cs="Times New Roman"/>
+        </w:rPr>
+        <w:t>(value);</w:t>
+      </w:r>
+      <w:r>
+        <w:rPr>
+          <w:rFonts w:ascii="Times New Roman" w:hAnsi="Times New Roman" w:cs="Times New Roman"/>
+        </w:rPr>
+        <w:br/>
+        <w:t xml:space="preserve">double </w:t>
+      </w:r>
+      <w:proofErr w:type="spellStart"/>
+      <w:r>
+        <w:rPr>
+          <w:rFonts w:ascii="Times New Roman" w:hAnsi="Times New Roman" w:cs="Times New Roman"/>
+        </w:rPr>
+        <w:t>parsedValue</w:t>
+      </w:r>
+      <w:proofErr w:type="spellEnd"/>
+      <w:r>
+        <w:rPr>
+          <w:rFonts w:ascii="Times New Roman" w:hAnsi="Times New Roman" w:cs="Times New Roman"/>
+        </w:rPr>
+        <w:t xml:space="preserve"> = </w:t>
+      </w:r>
+      <w:proofErr w:type="spellStart"/>
+      <w:r>
+        <w:rPr>
+          <w:rFonts w:ascii="Times New Roman" w:hAnsi="Times New Roman" w:cs="Times New Roman"/>
+        </w:rPr>
+        <w:t>Double.parseDouble</w:t>
+      </w:r>
+      <w:proofErr w:type="spellEnd"/>
+      <w:r>
+        <w:rPr>
+          <w:rFonts w:ascii="Times New Roman" w:hAnsi="Times New Roman" w:cs="Times New Roman"/>
+        </w:rPr>
+        <w:t>(</w:t>
+      </w:r>
+      <w:proofErr w:type="spellStart"/>
+      <w:r>
+        <w:rPr>
+          <w:rFonts w:ascii="Times New Roman" w:hAnsi="Times New Roman" w:cs="Times New Roman"/>
+        </w:rPr>
+        <w:t>str</w:t>
+      </w:r>
+      <w:proofErr w:type="spellEnd"/>
+      <w:r>
+        <w:rPr>
+          <w:rFonts w:ascii="Times New Roman" w:hAnsi="Times New Roman" w:cs="Times New Roman"/>
+        </w:rPr>
+        <w:t>);</w:t>
+      </w:r>
+    </w:p>
+    <w:p>
+      <w:pPr>
+        <w:pStyle w:val="Heading3"/>
+        <w:rPr>
+          <w:rFonts w:ascii="Times New Roman" w:hAnsi="Times New Roman" w:cs="Times New Roman"/>
+        </w:rPr>
+      </w:pPr>
+      <w:proofErr w:type="spellStart"/>
+      <w:r>
+        <w:rPr>
+          <w:rStyle w:val="Strong"/>
+          <w:rFonts w:ascii="Times New Roman" w:hAnsi="Times New Roman" w:cs="Times New Roman"/>
+          <w:b w:val="0"/>
+          <w:bCs w:val="0"/>
+        </w:rPr>
+        <w:t>i</w:t>
+      </w:r>
+      <w:proofErr w:type="spellEnd"/>
+      <w:r>
+        <w:rPr>
+          <w:rStyle w:val="Strong"/>
+          <w:rFonts w:ascii="Times New Roman" w:hAnsi="Times New Roman" w:cs="Times New Roman"/>
+          <w:b w:val="0"/>
+          <w:bCs w:val="0"/>
+        </w:rPr>
+        <w:t xml:space="preserve">. Purpose of </w:t>
+      </w:r>
+      <w:proofErr w:type="spellStart"/>
+      <w:proofErr w:type="gramStart"/>
+      <w:r>
+        <w:rPr>
+          <w:rStyle w:val="Strong"/>
+          <w:rFonts w:ascii="Times New Roman" w:hAnsi="Times New Roman" w:cs="Times New Roman"/>
+          <w:b w:val="0"/>
+          <w:bCs w:val="0"/>
+        </w:rPr>
+        <w:t>String.valueOf</w:t>
+      </w:r>
+      <w:proofErr w:type="spellEnd"/>
+      <w:r>
+        <w:rPr>
+          <w:rStyle w:val="Strong"/>
+          <w:rFonts w:ascii="Times New Roman" w:hAnsi="Times New Roman" w:cs="Times New Roman"/>
+          <w:b w:val="0"/>
+          <w:bCs w:val="0"/>
+        </w:rPr>
+        <w:t>(</w:t>
+      </w:r>
+      <w:proofErr w:type="gramEnd"/>
+      <w:r>
+        <w:rPr>
+          <w:rStyle w:val="Strong"/>
+          <w:rFonts w:ascii="Times New Roman" w:hAnsi="Times New Roman" w:cs="Times New Roman"/>
+          <w:b w:val="0"/>
+          <w:bCs w:val="0"/>
+        </w:rPr>
+        <w:t>)?</w:t>
+      </w:r>
+    </w:p>
+    <w:p>
+      <w:pPr>
+        <w:pStyle w:val="NormalWeb"/>
+      </w:pPr>
+      <w:r>
+        <w:t>a. String → long</w:t>
+      </w:r>
+      <w:r>
+        <w:br/>
+        <w:t>b. long → string</w:t>
+      </w:r>
+      <w:r>
+        <w:br/>
+        <w:t xml:space="preserve">c. string → </w:t>
+      </w:r>
+      <w:proofErr w:type="spellStart"/>
+      <w:r>
+        <w:t>double</w:t>
+      </w:r>
+      <w:r>
+        <w:br/>
+        <w:t>d</w:t>
+      </w:r>
+      <w:proofErr w:type="spellEnd"/>
+      <w:r>
+        <w:t>. double → string</w:t>
+      </w:r>
+    </w:p>
+    <w:p>
+      <w:pPr>
+        <w:pStyle w:val="NormalWeb"/>
+      </w:pPr>
+      <w:r>
+        <w:rPr>
+          <w:rFonts w:ascii="Segoe UI Symbol" w:hAnsi="Segoe UI Symbol" w:cs="Segoe UI Symbol"/>
+        </w:rPr>
+        <w:t>✅</w:t>
+      </w:r>
+      <w:r>
+        <w:t xml:space="preserve"> </w:t>
+      </w:r>
+      <w:r>
+        <w:rPr>
+          <w:rStyle w:val="Strong"/>
+        </w:rPr>
+        <w:t>Answer: b. Converts long value to string</w:t>
+      </w:r>
+    </w:p>
+    <w:p>
+      <w:pPr>
+        <w:pStyle w:val="Heading3"/>
+        <w:rPr>
+          <w:rFonts w:ascii="Times New Roman" w:hAnsi="Times New Roman" w:cs="Times New Roman"/>
+        </w:rPr>
+      </w:pPr>
+      <w:r>
+        <w:rPr>
+          <w:rStyle w:val="Strong"/>
+          <w:rFonts w:ascii="Times New Roman" w:hAnsi="Times New Roman" w:cs="Times New Roman"/>
+          <w:b w:val="0"/>
+          <w:bCs w:val="0"/>
+        </w:rPr>
+        <w:t xml:space="preserve">ii. What does </w:t>
+      </w:r>
+      <w:proofErr w:type="spellStart"/>
+      <w:proofErr w:type="gramStart"/>
+      <w:r>
+        <w:rPr>
+          <w:rStyle w:val="Strong"/>
+          <w:rFonts w:ascii="Times New Roman" w:hAnsi="Times New Roman" w:cs="Times New Roman"/>
+          <w:b w:val="0"/>
+          <w:bCs w:val="0"/>
+        </w:rPr>
+        <w:t>Double.parseDouble</w:t>
+      </w:r>
+      <w:proofErr w:type="spellEnd"/>
+      <w:r>
+        <w:rPr>
+          <w:rStyle w:val="Strong"/>
+          <w:rFonts w:ascii="Times New Roman" w:hAnsi="Times New Roman" w:cs="Times New Roman"/>
+          <w:b w:val="0"/>
+          <w:bCs w:val="0"/>
+        </w:rPr>
+        <w:t>(</w:t>
+      </w:r>
+      <w:proofErr w:type="gramEnd"/>
+      <w:r>
+        <w:rPr>
+          <w:rStyle w:val="Strong"/>
+          <w:rFonts w:ascii="Times New Roman" w:hAnsi="Times New Roman" w:cs="Times New Roman"/>
+          <w:b w:val="0"/>
+          <w:bCs w:val="0"/>
+        </w:rPr>
+        <w:t>) do?</w:t>
+      </w:r>
+    </w:p>
+    <w:p>
+      <w:pPr>
+        <w:pStyle w:val="NormalWeb"/>
+      </w:pPr>
+      <w:r>
+        <w:t>a. String → double</w:t>
+      </w:r>
+      <w:r>
+        <w:br/>
+        <w:t>b. double → string</w:t>
+      </w:r>
+      <w:r>
+        <w:br/>
+        <w:t xml:space="preserve">c. long → </w:t>
+      </w:r>
+      <w:proofErr w:type="spellStart"/>
+      <w:r>
+        <w:t>double</w:t>
+      </w:r>
+      <w:r>
+        <w:br/>
+        <w:t>d</w:t>
+      </w:r>
+      <w:proofErr w:type="spellEnd"/>
+      <w:r>
+        <w:t>. double → long</w:t>
+      </w:r>
+    </w:p>
+    <w:p>
+      <w:pPr>
+        <w:pStyle w:val="NormalWeb"/>
+      </w:pPr>
+      <w:r>
+        <w:rPr>
+          <w:rFonts w:ascii="Segoe UI Symbol" w:hAnsi="Segoe UI Symbol" w:cs="Segoe UI Symbol"/>
+        </w:rPr>
+        <w:t>✅</w:t>
+      </w:r>
+      <w:r>
+        <w:t xml:space="preserve"> </w:t>
+      </w:r>
+      <w:r>
+        <w:rPr>
+          <w:rStyle w:val="Strong"/>
+        </w:rPr>
+        <w:t>Answer: a. Converts string to double</w:t>
+      </w:r>
+    </w:p>
+    <w:p>
+      <w:pPr>
+        <w:pStyle w:val="Heading3"/>
+        <w:rPr>
+          <w:rFonts w:ascii="Times New Roman" w:hAnsi="Times New Roman" w:cs="Times New Roman"/>
+        </w:rPr>
+      </w:pPr>
+      <w:r>
+        <w:rPr>
+          <w:rStyle w:val="Strong"/>
+          <w:rFonts w:ascii="Times New Roman" w:hAnsi="Times New Roman" w:cs="Times New Roman"/>
+          <w:b w:val="0"/>
+          <w:bCs w:val="0"/>
+        </w:rPr>
+        <w:t>iii. What is the error in the program?</w:t>
+      </w:r>
+    </w:p>
+    <w:p>
+      <w:pPr>
+        <w:pStyle w:val="NormalWeb"/>
+      </w:pPr>
+      <w:proofErr w:type="gramStart"/>
+      <w:r>
+        <w:t>a</w:t>
+      </w:r>
+      <w:proofErr w:type="gramEnd"/>
+      <w:r>
+        <w:t xml:space="preserve">. double </w:t>
+      </w:r>
+      <w:proofErr w:type="spellStart"/>
+      <w:r>
+        <w:t>parsedValue</w:t>
+      </w:r>
+      <w:proofErr w:type="spellEnd"/>
+      <w:r>
+        <w:t xml:space="preserve"> line</w:t>
+      </w:r>
+      <w:r>
+        <w:br/>
+        <w:t xml:space="preserve">b. </w:t>
+      </w:r>
+      <w:proofErr w:type="spellStart"/>
+      <w:r>
+        <w:t>String.valueOf</w:t>
+      </w:r>
+      <w:proofErr w:type="spellEnd"/>
+      <w:r>
+        <w:t xml:space="preserve"> line</w:t>
+      </w:r>
+      <w:r>
+        <w:br/>
+        <w:t xml:space="preserve">c. </w:t>
+      </w:r>
+      <w:proofErr w:type="spellStart"/>
+      <w:r>
+        <w:t>int</w:t>
+      </w:r>
+      <w:proofErr w:type="spellEnd"/>
+      <w:r>
+        <w:t xml:space="preserve"> value = 123456789L;</w:t>
+      </w:r>
+      <w:r>
+        <w:br/>
+        <w:t>d. None</w:t>
+      </w:r>
+    </w:p>
+    <w:p>
+      <w:pPr>
+        <w:pStyle w:val="NormalWeb"/>
+      </w:pPr>
+      <w:r>
+        <w:rPr>
+          <w:rFonts w:ascii="Segoe UI Symbol" w:hAnsi="Segoe UI Symbol" w:cs="Segoe UI Symbol"/>
+        </w:rPr>
+        <w:t>✅</w:t>
+      </w:r>
+      <w:r>
+        <w:t xml:space="preserve"> </w:t>
+      </w:r>
+      <w:r>
+        <w:rPr>
+          <w:rStyle w:val="Strong"/>
+        </w:rPr>
+        <w:t xml:space="preserve">Answer: c. </w:t>
+      </w:r>
+      <w:proofErr w:type="spellStart"/>
+      <w:r>
+        <w:rPr>
+          <w:rStyle w:val="Strong"/>
+        </w:rPr>
+        <w:t>int</w:t>
+      </w:r>
+      <w:proofErr w:type="spellEnd"/>
+      <w:r>
+        <w:rPr>
+          <w:rStyle w:val="Strong"/>
+        </w:rPr>
+        <w:t xml:space="preserve"> value = 123456789L;</w:t>
+      </w:r>
+    </w:p>
+    <w:p>
+      <w:pPr>
+        <w:pStyle w:val="NormalWeb"/>
+      </w:pPr>
+      <w:r>
+        <w:rPr>
+          <w:rFonts w:ascii="Segoe UI Symbol" w:hAnsi="Segoe UI Symbol" w:cs="Segoe UI Symbol"/>
+        </w:rPr>
+        <w:t>💡</w:t>
+      </w:r>
+      <w:r>
+        <w:t xml:space="preserve"> </w:t>
+      </w:r>
+      <w:r>
+        <w:rPr>
+          <w:rStyle w:val="Strong"/>
+        </w:rPr>
+        <w:t>Explanation</w:t>
+      </w:r>
+      <w:proofErr w:type="gramStart"/>
+      <w:r>
+        <w:rPr>
+          <w:rStyle w:val="Strong"/>
+        </w:rPr>
+        <w:t>:</w:t>
+      </w:r>
+      <w:proofErr w:type="gramEnd"/>
+      <w:r>
+        <w:br/>
+      </w:r>
+      <w:r>
+        <w:rPr>
+          <w:rStyle w:val="HTMLCode"/>
+          <w:rFonts w:ascii="Times New Roman" w:hAnsi="Times New Roman" w:cs="Times New Roman"/>
+        </w:rPr>
+        <w:t>L</w:t>
+      </w:r>
+      <w:r>
+        <w:t xml:space="preserve"> means long → should be:</w:t>
+      </w:r>
+    </w:p>
+    <w:p>
+      <w:pPr>
+        <w:pStyle w:val="HTMLPreformatted"/>
+        <w:rPr>
+          <w:rFonts w:ascii="Times New Roman" w:hAnsi="Times New Roman" w:cs="Times New Roman"/>
+        </w:rPr>
+      </w:pPr>
+      <w:proofErr w:type="gramStart"/>
+      <w:r>
+        <w:rPr>
+          <w:rFonts w:ascii="Times New Roman" w:hAnsi="Times New Roman" w:cs="Times New Roman"/>
+        </w:rPr>
+        <w:t>long</w:t>
+      </w:r>
+      <w:proofErr w:type="gramEnd"/>
+      <w:r>
+        <w:rPr>
+          <w:rFonts w:ascii="Times New Roman" w:hAnsi="Times New Roman" w:cs="Times New Roman"/>
+        </w:rPr>
+        <w:t xml:space="preserve"> value = 123456789L;</w:t>
+      </w:r>
+    </w:p>
+    <w:p>
+      <w:pPr>
+        <w:ind w:left="360"/>
+        <w:outlineLvl w:val="1"/>
         <w:rPr>
           <w:b/>
           <w:bCs/>
           <w:sz w:val="36"/>
           <w:szCs w:val="36"/>
         </w:rPr>
-        <w:t>TICK (</w:t>
-      </w:r>
-      <w:r>
-        <w:rPr>
-          <w:rFonts w:ascii="Segoe UI Symbol" w:hAnsi="Segoe UI Symbol" w:cs="Segoe UI Symbol"/>
+      </w:pPr>
+    </w:p>
+    <w:p>
+      <w:pPr>
+        <w:pStyle w:val="ListParagraph"/>
+        <w:ind w:left="797"/>
+        <w:outlineLvl w:val="1"/>
+        <w:rPr>
           <w:b/>
           <w:bCs/>
           <w:sz w:val="36"/>
           <w:szCs w:val="36"/>
         </w:rPr>
-        <w:t>✓</w:t>
-      </w:r>
-      <w:r>
-        <w:rPr>
-          <w:b/>
-          <w:bCs/>
-          <w:sz w:val="36"/>
-          <w:szCs w:val="36"/>
-        </w:rPr>
-        <w:t>) THE CORRECT ANSWER</w:t>
-      </w:r>
-    </w:p>
-    <w:p>
-      <w:pPr>
-        <w:pStyle w:val="ListParagraph"/>
-        <w:ind w:left="797"/>
-        <w:outlineLvl w:val="1"/>
-        <w:rPr>
-          <w:b/>
-          <w:bCs/>
-          <w:sz w:val="36"/>
-          <w:szCs w:val="36"/>
-        </w:rPr>
       </w:pPr>
     </w:p>
     <w:p>
@@ -168,7 +2879,7 @@
     </w:p>
     <w:sectPr>
       <w:pgSz w:w="12240" w:h="15840"/>
-      <w:pgMar w:top="810" w:right="720" w:bottom="990" w:left="1260" w:header="720" w:footer="720" w:gutter="0"/>
+      <w:pgMar w:top="810" w:right="720" w:bottom="900" w:left="1260" w:header="720" w:footer="720" w:gutter="0"/>
       <w:pgBorders w:offsetFrom="page">
         <w:top w:val="birdsFlight" w:sz="15" w:space="24" w:color="auto"/>
         <w:left w:val="birdsFlight" w:sz="15" w:space="24" w:color="auto"/>
@@ -745,6 +3456,155 @@
     </w:lvl>
   </w:abstractNum>
   <w:abstractNum w:abstractNumId="4" w15:restartNumberingAfterBreak="0">
+    <w:nsid w:val="14D902BD"/>
+    <w:multiLevelType w:val="multilevel"/>
+    <w:tmpl w:val="89864CAC"/>
+    <w:lvl w:ilvl="0">
+      <w:start w:val="1"/>
+      <w:numFmt w:val="bullet"/>
+      <w:lvlText w:val=""/>
+      <w:lvlJc w:val="left"/>
+      <w:pPr>
+        <w:tabs>
+          <w:tab w:val="num" w:pos="720"/>
+        </w:tabs>
+        <w:ind w:left="720" w:hanging="360"/>
+      </w:pPr>
+      <w:rPr>
+        <w:rFonts w:ascii="Symbol" w:hAnsi="Symbol" w:hint="default"/>
+        <w:sz w:val="20"/>
+      </w:rPr>
+    </w:lvl>
+    <w:lvl w:ilvl="1" w:tentative="1">
+      <w:start w:val="1"/>
+      <w:numFmt w:val="bullet"/>
+      <w:lvlText w:val="o"/>
+      <w:lvlJc w:val="left"/>
+      <w:pPr>
+        <w:tabs>
+          <w:tab w:val="num" w:pos="1440"/>
+        </w:tabs>
+        <w:ind w:left="1440" w:hanging="360"/>
+      </w:pPr>
+      <w:rPr>
+        <w:rFonts w:ascii="Courier New" w:hAnsi="Courier New" w:hint="default"/>
+        <w:sz w:val="20"/>
+      </w:rPr>
+    </w:lvl>
+    <w:lvl w:ilvl="2" w:tentative="1">
+      <w:start w:val="1"/>
+      <w:numFmt w:val="bullet"/>
+      <w:lvlText w:val=""/>
+      <w:lvlJc w:val="left"/>
+      <w:pPr>
+        <w:tabs>
+          <w:tab w:val="num" w:pos="2160"/>
+        </w:tabs>
+        <w:ind w:left="2160" w:hanging="360"/>
+      </w:pPr>
+      <w:rPr>
+        <w:rFonts w:ascii="Wingdings" w:hAnsi="Wingdings" w:hint="default"/>
+        <w:sz w:val="20"/>
+      </w:rPr>
+    </w:lvl>
+    <w:lvl w:ilvl="3" w:tentative="1">
+      <w:start w:val="1"/>
+      <w:numFmt w:val="bullet"/>
+      <w:lvlText w:val=""/>
+      <w:lvlJc w:val="left"/>
+      <w:pPr>
+        <w:tabs>
+          <w:tab w:val="num" w:pos="2880"/>
+        </w:tabs>
+        <w:ind w:left="2880" w:hanging="360"/>
+      </w:pPr>
+      <w:rPr>
+        <w:rFonts w:ascii="Wingdings" w:hAnsi="Wingdings" w:hint="default"/>
+        <w:sz w:val="20"/>
+      </w:rPr>
+    </w:lvl>
+    <w:lvl w:ilvl="4" w:tentative="1">
+      <w:start w:val="1"/>
+      <w:numFmt w:val="bullet"/>
+      <w:lvlText w:val=""/>
+      <w:lvlJc w:val="left"/>
+      <w:pPr>
+        <w:tabs>
+          <w:tab w:val="num" w:pos="3600"/>
+        </w:tabs>
+        <w:ind w:left="3600" w:hanging="360"/>
+      </w:pPr>
+      <w:rPr>
+        <w:rFonts w:ascii="Wingdings" w:hAnsi="Wingdings" w:hint="default"/>
+        <w:sz w:val="20"/>
+      </w:rPr>
+    </w:lvl>
+    <w:lvl w:ilvl="5" w:tentative="1">
+      <w:start w:val="1"/>
+      <w:numFmt w:val="bullet"/>
+      <w:lvlText w:val=""/>
+      <w:lvlJc w:val="left"/>
+      <w:pPr>
+        <w:tabs>
+          <w:tab w:val="num" w:pos="4320"/>
+        </w:tabs>
+        <w:ind w:left="4320" w:hanging="360"/>
+      </w:pPr>
+      <w:rPr>
+        <w:rFonts w:ascii="Wingdings" w:hAnsi="Wingdings" w:hint="default"/>
+        <w:sz w:val="20"/>
+      </w:rPr>
+    </w:lvl>
+    <w:lvl w:ilvl="6" w:tentative="1">
+      <w:start w:val="1"/>
+      <w:numFmt w:val="bullet"/>
+      <w:lvlText w:val=""/>
+      <w:lvlJc w:val="left"/>
+      <w:pPr>
+        <w:tabs>
+          <w:tab w:val="num" w:pos="5040"/>
+        </w:tabs>
+        <w:ind w:left="5040" w:hanging="360"/>
+      </w:pPr>
+      <w:rPr>
+        <w:rFonts w:ascii="Wingdings" w:hAnsi="Wingdings" w:hint="default"/>
+        <w:sz w:val="20"/>
+      </w:rPr>
+    </w:lvl>
+    <w:lvl w:ilvl="7" w:tentative="1">
+      <w:start w:val="1"/>
+      <w:numFmt w:val="bullet"/>
+      <w:lvlText w:val=""/>
+      <w:lvlJc w:val="left"/>
+      <w:pPr>
+        <w:tabs>
+          <w:tab w:val="num" w:pos="5760"/>
+        </w:tabs>
+        <w:ind w:left="5760" w:hanging="360"/>
+      </w:pPr>
+      <w:rPr>
+        <w:rFonts w:ascii="Wingdings" w:hAnsi="Wingdings" w:hint="default"/>
+        <w:sz w:val="20"/>
+      </w:rPr>
+    </w:lvl>
+    <w:lvl w:ilvl="8" w:tentative="1">
+      <w:start w:val="1"/>
+      <w:numFmt w:val="bullet"/>
+      <w:lvlText w:val=""/>
+      <w:lvlJc w:val="left"/>
+      <w:pPr>
+        <w:tabs>
+          <w:tab w:val="num" w:pos="6480"/>
+        </w:tabs>
+        <w:ind w:left="6480" w:hanging="360"/>
+      </w:pPr>
+      <w:rPr>
+        <w:rFonts w:ascii="Wingdings" w:hAnsi="Wingdings" w:hint="default"/>
+        <w:sz w:val="20"/>
+      </w:rPr>
+    </w:lvl>
+  </w:abstractNum>
+  <w:abstractNum w:abstractNumId="5" w15:restartNumberingAfterBreak="0">
     <w:nsid w:val="21E17468"/>
     <w:multiLevelType w:val="multilevel"/>
     <w:tmpl w:val="18D2A07A"/>
@@ -893,7 +3753,7 @@
       </w:rPr>
     </w:lvl>
   </w:abstractNum>
-  <w:abstractNum w:abstractNumId="5" w15:restartNumberingAfterBreak="0">
+  <w:abstractNum w:abstractNumId="6" w15:restartNumberingAfterBreak="0">
     <w:nsid w:val="26844E53"/>
     <w:multiLevelType w:val="multilevel"/>
     <w:tmpl w:val="18B2A280"/>
@@ -1042,7 +3902,7 @@
       </w:rPr>
     </w:lvl>
   </w:abstractNum>
-  <w:abstractNum w:abstractNumId="6" w15:restartNumberingAfterBreak="0">
+  <w:abstractNum w:abstractNumId="7" w15:restartNumberingAfterBreak="0">
     <w:nsid w:val="31A657CB"/>
     <w:multiLevelType w:val="multilevel"/>
     <w:tmpl w:val="C3FE976C"/>
@@ -1191,7 +4051,7 @@
       </w:rPr>
     </w:lvl>
   </w:abstractNum>
-  <w:abstractNum w:abstractNumId="7" w15:restartNumberingAfterBreak="0">
+  <w:abstractNum w:abstractNumId="8" w15:restartNumberingAfterBreak="0">
     <w:nsid w:val="34E0468C"/>
     <w:multiLevelType w:val="multilevel"/>
     <w:tmpl w:val="7EB8DD6C"/>
@@ -1340,7 +4200,7 @@
       </w:rPr>
     </w:lvl>
   </w:abstractNum>
-  <w:abstractNum w:abstractNumId="8" w15:restartNumberingAfterBreak="0">
+  <w:abstractNum w:abstractNumId="9" w15:restartNumberingAfterBreak="0">
     <w:nsid w:val="45F50482"/>
     <w:multiLevelType w:val="multilevel"/>
     <w:tmpl w:val="41722FCA"/>
@@ -1453,7 +4313,7 @@
       </w:pPr>
     </w:lvl>
   </w:abstractNum>
-  <w:abstractNum w:abstractNumId="9" w15:restartNumberingAfterBreak="0">
+  <w:abstractNum w:abstractNumId="10" w15:restartNumberingAfterBreak="0">
     <w:nsid w:val="4D2844FF"/>
     <w:multiLevelType w:val="multilevel"/>
     <w:tmpl w:val="58E812D8"/>
@@ -1566,7 +4426,7 @@
       </w:pPr>
     </w:lvl>
   </w:abstractNum>
-  <w:abstractNum w:abstractNumId="10" w15:restartNumberingAfterBreak="0">
+  <w:abstractNum w:abstractNumId="11" w15:restartNumberingAfterBreak="0">
     <w:nsid w:val="55393646"/>
     <w:multiLevelType w:val="hybridMultilevel"/>
     <w:tmpl w:val="406A89DE"/>
@@ -1655,7 +4515,7 @@
       </w:pPr>
     </w:lvl>
   </w:abstractNum>
-  <w:abstractNum w:abstractNumId="11" w15:restartNumberingAfterBreak="0">
+  <w:abstractNum w:abstractNumId="12" w15:restartNumberingAfterBreak="0">
     <w:nsid w:val="6C66611A"/>
     <w:multiLevelType w:val="multilevel"/>
     <w:tmpl w:val="FE68A72C"/>
@@ -1768,7 +4628,7 @@
       </w:pPr>
     </w:lvl>
   </w:abstractNum>
-  <w:abstractNum w:abstractNumId="12" w15:restartNumberingAfterBreak="0">
+  <w:abstractNum w:abstractNumId="13" w15:restartNumberingAfterBreak="0">
     <w:nsid w:val="6EF62678"/>
     <w:multiLevelType w:val="multilevel"/>
     <w:tmpl w:val="E49E094C"/>
@@ -1881,7 +4741,7 @@
       </w:pPr>
     </w:lvl>
   </w:abstractNum>
-  <w:abstractNum w:abstractNumId="13" w15:restartNumberingAfterBreak="0">
+  <w:abstractNum w:abstractNumId="14" w15:restartNumberingAfterBreak="0">
     <w:nsid w:val="793668CC"/>
     <w:multiLevelType w:val="multilevel"/>
     <w:tmpl w:val="4300BB00"/>
@@ -1995,16 +4855,16 @@
     </w:lvl>
   </w:abstractNum>
   <w:num w:numId="1">
-    <w:abstractNumId w:val="8"/>
+    <w:abstractNumId w:val="9"/>
   </w:num>
   <w:num w:numId="2">
-    <w:abstractNumId w:val="5"/>
+    <w:abstractNumId w:val="6"/>
   </w:num>
   <w:num w:numId="3">
-    <w:abstractNumId w:val="9"/>
+    <w:abstractNumId w:val="10"/>
   </w:num>
   <w:num w:numId="4">
-    <w:abstractNumId w:val="7"/>
+    <w:abstractNumId w:val="8"/>
   </w:num>
   <w:num w:numId="5">
     <w:abstractNumId w:val="1"/>
@@ -2013,28 +4873,31 @@
     <w:abstractNumId w:val="2"/>
   </w:num>
   <w:num w:numId="7">
-    <w:abstractNumId w:val="12"/>
+    <w:abstractNumId w:val="13"/>
   </w:num>
   <w:num w:numId="8">
-    <w:abstractNumId w:val="4"/>
+    <w:abstractNumId w:val="5"/>
   </w:num>
   <w:num w:numId="9">
-    <w:abstractNumId w:val="13"/>
+    <w:abstractNumId w:val="14"/>
   </w:num>
   <w:num w:numId="10">
     <w:abstractNumId w:val="3"/>
   </w:num>
   <w:num w:numId="11">
-    <w:abstractNumId w:val="11"/>
+    <w:abstractNumId w:val="12"/>
   </w:num>
   <w:num w:numId="12">
     <w:abstractNumId w:val="0"/>
   </w:num>
   <w:num w:numId="13">
-    <w:abstractNumId w:val="6"/>
+    <w:abstractNumId w:val="7"/>
   </w:num>
   <w:num w:numId="14">
-    <w:abstractNumId w:val="10"/>
+    <w:abstractNumId w:val="11"/>
+  </w:num>
+  <w:num w:numId="15">
+    <w:abstractNumId w:val="4"/>
   </w:num>
 </w:numbering>
 </file>

</xml_diff>